<commit_message>
SC1 Slow Wage Growth Lege Brief v1.1: reworked around the FINAL proposal grid (three proposals; raise-minimum-wage folded into the age-bracketed proposal) — spotlights carry each proposal's reported frequency/consensus/concerns with record facts addressed to them (no age-based rates in any of the 24 minimum-wage bills, $15 ballot questions, apprentice credit open to any employer, awareness provisos, direct-bonus design never filed); config and Appendix H updated; record unchanged; 8 pp, all scans and vote pairs verified
Co-authored-by: CaptainWrechols <CaptainWrechols@users.noreply.github.com>
</commit_message>
<xml_diff>
--- a/briefs/south-carolina/slow-wage-growth/citizen-v2/SC1-Slow-Wage-Growth-Lege-Brief.docx
+++ b/briefs/south-carolina/slow-wage-growth/citizen-v2/SC1-Slow-Wage-Growth-Lege-Brief.docx
@@ -35,7 +35,7 @@
           <w:szCs w:val="20"/>
           <w:rtl w:val="0"/>
         </w:rPr>
-        <w:t xml:space="preserve">The legislative record behind South Carolinians' wage proposals, 2019–2026 — organized by how close each idea has come to becoming law.</w:t>
+        <w:t xml:space="preserve">The legislative record behind South Carolinians' three slow-wage-growth proposals, 2019–2026 — organized by how close each idea has come to becoming law.</w:t>
       </w:r>
     </w:p>
     <w:p>
@@ -71,7 +71,7 @@
           <w:szCs w:val="20"/>
           <w:rtl w:val="0"/>
         </w:rPr>
-        <w:t xml:space="preserve">South Carolina has no state minimum wage law: the federal floor of $7.25 an hour applies, and state law keeps cities and counties from setting a higher one. Across the last four two-year sessions (2019–2026), the General Assembly took up 106 wage-and-workforce bills in this set, and 13 became law. The record splits cleanly in two. Bills that would raise pay directly — a state minimum wage, equal-pay rules, paid sick leave — died in their first committee every single time, without a recorded vote anywhere in eight years. Bills that build pathways to better-paying jobs — apprenticeships, workforce scholarships, technical college training — became law again and again, almost always unanimously. When a wage or workforce bill reached a floor vote at all, it lost exactly once in eight years.</w:t>
+        <w:t xml:space="preserve">South Carolina has no state minimum wage law: the federal floor of $7.25 an hour applies, and state law keeps cities and counties from setting a higher one. Across the last four two-year sessions (2019–2026), the General Assembly took up 106 wage-and-workforce bills in this set, and 13 became law. The record splits cleanly in two. Bills that would raise pay directly — a state minimum wage, equal-pay rules, paid sick leave — died in their first committee every single time, without a recorded vote anywhere in eight years. Bills that build pathways to better-paying jobs — apprenticeships, workforce scholarships, technical college training — became law again and again, almost always unanimously. Against that record, the three proposals that advanced out of the Community Conversations sit in three different places: workforce development is substantially law and still growing; the employer living-wage incentive exists as a filed bill that has not had a vote; and the age-bracketed minimum wage has half a record — the adult-raise half has been filed 24 times without a vote, and the youth-wage half has never been filed at all.</w:t>
       </w:r>
     </w:p>
     <w:tbl>
@@ -311,7 +311,7 @@
                 <w:szCs w:val="28"/>
                 <w:rtl w:val="0"/>
               </w:rPr>
-              <w:t xml:space="preserve">1 of 4</w:t>
+              <w:t xml:space="preserve">1 of 3</w:t>
             </w:r>
             <w:r>
               <w:rPr>
@@ -332,7 +332,7 @@
                 <w:szCs w:val="20"/>
                 <w:rtl w:val="0"/>
               </w:rPr>
-              <w:t xml:space="preserve">citizen proposals already substantially law — apprenticeships and career training</w:t>
+              <w:t xml:space="preserve">citizen proposals already substantially law — workforce development</w:t>
             </w:r>
             <w:r>
               <w:rPr>
@@ -382,7 +382,7 @@
           <w:szCs w:val="20"/>
           <w:rtl w:val="0"/>
         </w:rPr>
-        <w:t xml:space="preserve">Some of the state's biggest wage-and-training decisions never appear in a stand-alone bill. They live in provisos — one-year policy rules enacted inside Part IB of the annual budget bill. FY 2026-27 proviso 117.155 (GP: Lead Apprenticeship Agency) makes the technical college system, through Apprenticeship Carolina, the lead agency for all registered apprenticeships in the state — a role that has existed only in the budget, renewed each year since FY 2023-24, never in permanent law. FY 2026-27 proviso 25.4 (TEC: Critical Statewide Workforce Needs) steers technical college money to the fields with the most unmet employer demand, and its neighbors fund a workforce pilot for people with disabilities (25.7) and a manufacturing-careers awareness campaign (25.8). The lottery-funding proviso (3.8) pays for SC WINS workforce scholarships each year — $17 million in FY 2021-22 and FY 2022-23, a peak of $93.7 million in FY 2023-24, $24.7 million this year. The annual state-employee raise is also set here, not in a pay statute: 2.5%, 3%, tiered raises, then 2% in each of the last two budgets (proviso 117.138 this year). One budget year is a gap: FY 2020-21 has no enacted proviso set — the budget bill died in committee during COVID and the state ran on a continuing resolution. Votes on provisos are votes on the whole budget bill, never on one proviso alone.</w:t>
+        <w:t xml:space="preserve">Some of the state's biggest wage-and-training decisions never appear in a stand-alone bill. They live in provisos — one-year policy rules enacted inside Part IB of the annual budget bill. FY 2026-27 proviso 117.155 (GP: Lead Apprenticeship Agency) makes the technical college system, through Apprenticeship Carolina, the lead agency for all registered apprenticeships in the state — a role that has existed only in the budget, renewed each year since FY 2023-24, never in permanent law. FY 2026-27 proviso 25.4 (TEC: Critical Statewide Workforce Needs) steers technical college money to the fields with the most unmet employer demand, and its neighbors fund a workforce pilot for people with disabilities (25.7) and a public-awareness campaign about manufacturing and related careers (25.8) — the budget's answer, so far, to how people hear about these programs. The lottery-funding proviso (3.8) pays for SC WINS workforce scholarships each year — $17 million in FY 2021-22 and FY 2022-23, a peak of $93.7 million in FY 2023-24, $24.7 million this year. The annual state-employee raise is also set here, not in a pay statute: 2.5%, 3%, tiered raises, then 2% in each of the last two budgets (proviso 117.138 this year). One budget year is a gap: FY 2020-21 has no enacted proviso set — the budget bill died in committee during COVID and the state ran on a continuing resolution. Votes on provisos are votes on the whole budget bill, never on one proviso alone.</w:t>
       </w:r>
     </w:p>
     <w:p>
@@ -827,7 +827,7 @@
           <w:szCs w:val="20"/>
           <w:rtl w:val="0"/>
         </w:rPr>
-        <w:t xml:space="preserve">The workforce-pathway lane keeps extending — each law built on the last, from proviso-funded scholarships (2019) to statute (2022) to a statewide office (2023) to a bigger employer credit (2024) — and none of it has ever lost a floor vote. Skills-based hiring has a unanimous Senate vote behind it and three committee deaths; the design keeps returning. The wage-linked incentive machinery (job development credits keyed to pay levels) is updated routinely inside tax packages, which is the venue where the livable-wage credit idea would compete. And the two enacted wage floors show the shape of what passes: narrow, group-specific, near-unanimous.</w:t>
+        <w:t xml:space="preserve">The workforce-pathway lane keeps extending — each law built on the last, from proviso-funded scholarships (2019) to statute (2022) to a statewide office (2023) to a bigger employer credit (2024) — and none of it has ever lost a floor vote. Skills-based hiring has a unanimous Senate vote behind it and three committee deaths; the design keeps returning. The wage-linked incentive machinery (job development credits keyed to pay levels) is updated routinely inside tax packages, which is the venue where the living-wage incentive idea would compete. And the two enacted wage floors show the shape of what passes: narrow, group-specific, near-unanimous.</w:t>
       </w:r>
     </w:p>
     <w:p>
@@ -865,7 +865,7 @@
           <w:szCs w:val="20"/>
           <w:rtl w:val="0"/>
         </w:rPr>
-        <w:t xml:space="preserve">Two of the four citizen proposals have reached the General Assembly and stopped in their first committee; one has never been filed at all.</w:t>
+        <w:t xml:space="preserve">Measured against the three proposals: one is substantially law, one is filed but unvoted, and one has never been filed in the form participants described.</w:t>
       </w:r>
     </w:p>
     <w:p>
@@ -884,17 +884,17 @@
           <w:szCs w:val="20"/>
           <w:rtl w:val="0"/>
         </w:rPr>
-        <w:t xml:space="preserve">Raise the minimum wage.</w:t>
-      </w:r>
-      <w:r>
-        <w:rPr>
-          <w:rFonts w:ascii="Arial" w:cs="Arial" w:eastAsia="Arial" w:hAnsi="Arial"/>
-          <w:color w:val="444444"/>
-          <w:sz w:val="20"/>
-          <w:szCs w:val="20"/>
-          <w:rtl w:val="0"/>
-        </w:rPr>
-        <w:t xml:space="preserve"> Twenty-four bills in four sessions, none ever voted on: fixed floors of $10–$17 an hour (higher local minimums stay banned), phased three-year schedules with automatic inflation adjustments, the recurring "SC Minimum Wage Act" with agency-set annual updates, advisory ballot questions (S633, 2021; S28, 2023), a constitutional amendment (S147, 2019), and a wage-board mechanism setting minimum pay by occupation (H3735, 2025). They stop in the same rooms every session: House Labor, Commerce and Industry; House Ways and Means; Senate Labor, Commerce and Industry; Senate Judiciary. The same handful of members refile them each time.</w:t>
+        <w:t xml:space="preserve">An age-bracketed minimum wage with a youth wage.</w:t>
+      </w:r>
+      <w:r>
+        <w:rPr>
+          <w:rFonts w:ascii="Arial" w:cs="Arial" w:eastAsia="Arial" w:hAnsi="Arial"/>
+          <w:color w:val="444444"/>
+          <w:sz w:val="20"/>
+          <w:szCs w:val="20"/>
+          <w:rtl w:val="0"/>
+        </w:rPr>
+        <w:t xml:space="preserve"> No bill from 2019–2026 proposes a youth wage, a training wage, or any age-based wage bracket — the terms return zero hits in every bill's full text, verified statewide. The adult-raise half of the proposal has a deep record with no movement: twenty-four bills in four sessions, none ever voted on — fixed floors of $10–$17 an hour (higher local minimums stay banned), phased three-year schedules with automatic inflation adjustments, the recurring "SC Minimum Wage Act" with agency-set annual updates, advisory ballot questions (S633, 2021; S28, 2023), a constitutional amendment (S147, 2019), and a wage-board mechanism setting minimum pay by occupation (H3735, 2025). They stop in the same rooms every session: House Labor, Commerce and Industry; House Ways and Means; Senate Labor, Commerce and Industry; Senate Judiciary. The one tiered-wage law the legislature passed moved the other way: S533 removed a subminimum tier rather than creating one.</w:t>
       </w:r>
     </w:p>
     <w:p>
@@ -913,46 +913,17 @@
           <w:szCs w:val="20"/>
           <w:rtl w:val="0"/>
         </w:rPr>
-        <w:t xml:space="preserve">A youth wage or age-bracketed minimum.</w:t>
-      </w:r>
-      <w:r>
-        <w:rPr>
-          <w:rFonts w:ascii="Arial" w:cs="Arial" w:eastAsia="Arial" w:hAnsi="Arial"/>
-          <w:color w:val="444444"/>
-          <w:sz w:val="20"/>
-          <w:szCs w:val="20"/>
-          <w:rtl w:val="0"/>
-        </w:rPr>
-        <w:t xml:space="preserve"> Never filed. No bill from 2019–2026 proposes a youth wage, training wage, or any age-based bracket — the terms return zero hits in every bill's full text, verified statewide. The one tiered-wage law the legislature passed moved the other way: S533 removed a subminimum tier rather than creating one.</w:t>
-      </w:r>
-    </w:p>
-    <w:p>
-      <w:pPr>
-        <w:widowControl/>
-        <w:spacing w:after="49" w:line="276" w:lineRule="auto"/>
-        <w:rPr/>
-      </w:pPr>
-      <w:r>
-        <w:rPr>
-          <w:rFonts w:ascii="Arial" w:cs="Arial" w:eastAsia="Arial" w:hAnsi="Arial"/>
-          <w:b w:val="1"/>
-          <w:bCs w:val="1"/>
-          <w:color w:val="1a2d4f"/>
-          <w:sz w:val="20"/>
-          <w:szCs w:val="20"/>
-          <w:rtl w:val="0"/>
-        </w:rPr>
-        <w:t xml:space="preserve">Employer incentives for paying a living wage.</w:t>
-      </w:r>
-      <w:r>
-        <w:rPr>
-          <w:rFonts w:ascii="Arial" w:cs="Arial" w:eastAsia="Arial" w:hAnsi="Arial"/>
-          <w:color w:val="444444"/>
-          <w:sz w:val="20"/>
-          <w:szCs w:val="20"/>
-          <w:rtl w:val="0"/>
-        </w:rPr>
-        <w:t xml:space="preserve"> The exact design exists as a filed bill: H4603, the Small Business Livable Wage Tax Credit Act (2026) — an income tax credit for small employers paying at or above a livable wage — died in House Ways and Means without a vote when the session ended, as did H4245 (2025), which pairs tax relief for people leaving public assistance with credits for the businesses that hire and retain them. S398 (2021), wage and job obligations on subsidy recipients with clawbacks, died in Senate Labor, Commerce and Industry. The near-miss: the Redline Enterprise Zone Act (H4252, 2022) passed the House 103–2 and died in Senate Finance.</w:t>
+        <w:t xml:space="preserve">Government incentives for employers who pay a living wage.</w:t>
+      </w:r>
+      <w:r>
+        <w:rPr>
+          <w:rFonts w:ascii="Arial" w:cs="Arial" w:eastAsia="Arial" w:hAnsi="Arial"/>
+          <w:color w:val="444444"/>
+          <w:sz w:val="20"/>
+          <w:szCs w:val="20"/>
+          <w:rtl w:val="0"/>
+        </w:rPr>
+        <w:t xml:space="preserve"> The tax-credit version of the proposal exists as a filed bill: H4603, the Small Business Livable Wage Tax Credit Act (2026) — an income tax credit for small employers paying at or above a livable wage — died in House Ways and Means without a vote when the session ended, as did H4245 (2025), which pairs tax relief for people leaving public assistance with credits for the businesses that hire and retain them. The direct-bonus version has never been filed: no bill in this record proposes direct state payments to employers tied to wage levels. S398 (2021), wage and job obligations on subsidy recipients with clawbacks, died in Senate Labor, Commerce and Industry. The near-miss: the Redline Enterprise Zone Act (H4252, 2022) passed the House 103–2 and died in Senate Finance.</w:t>
       </w:r>
     </w:p>
     <w:p>
@@ -1135,7 +1106,7 @@
           <w:szCs w:val="20"/>
           <w:rtl w:val="0"/>
         </w:rPr>
-        <w:t xml:space="preserve">The wage floor itself is federal ground first: the Fair Labor Standards Act sets the $7.25 minimum, the overtime rules the 2025–26 tax-exemption bills worked around, and the $4.25 youth training wage employers may already pay for a worker's first 90 days — the layer any state youth-wage design would sit on top of. The subminimum-wage certificates for workers with disabilities that S533 banned are a federal program (FLSA Section 14(c)); the state law closed South Carolina to them. Registered apprenticeships are a U.S. Department of Labor program — the state's role, through Apprenticeship Carolina and the budget's lead-agency proviso, is recruiting employers into it, and the state apprentice tax credit (S557) pays employers who do. Federal workforce money flows through the state's system under the federal workforce law's state plan — the machinery H3726 reorganized. What has no federal layer at all is the core of this brief: whether South Carolina adopts a state minimum wage, whether cities may set their own (state law says no), the state tax credits, the technical college system, and SC WINS are state ground alone.</w:t>
+        <w:t xml:space="preserve">The wage floor itself is federal ground first: the Fair Labor Standards Act sets the $7.25 minimum, the overtime rules the 2025–26 tax-exemption bills worked around, and — directly relevant to the age-bracket proposal — a federal youth wage that already exists: employers may pay workers under 20 as little as $4.25 an hour for their first 90 days. Any state age bracket would sit on top of that layer and of a state minimum that does not yet exist. The subminimum-wage certificates for workers with disabilities that S533 banned are a federal program (FLSA Section 14(c)); the state law closed South Carolina to them. Registered apprenticeships are a U.S. Department of Labor program — the state's role, through Apprenticeship Carolina and the budget's lead-agency proviso, is recruiting employers into it, and the state apprentice tax credit (S557) pays employers who do. Federal workforce money flows through the state's system under the federal workforce law's state plan — the machinery H3726 reorganized. What has no federal layer at all is the core of this brief: whether South Carolina adopts a state minimum wage, whether cities may set their own (state law says no), the state tax credits, the technical college system, and SC WINS are state ground alone.</w:t>
       </w:r>
     </w:p>
     <w:p>
@@ -1208,7 +1179,7 @@
           <w:szCs w:val="20"/>
           <w:rtl w:val="0"/>
         </w:rPr>
-        <w:t xml:space="preserve">A focused, bill-by-bill look at how far each proposal from the Community Conversations has traveled. Each policy is sorted into the same viability groups the brief uses, so the brief's top section shows what is viable overall and these spotlights show how viable one policy may be.</w:t>
+        <w:t xml:space="preserve">A focused, bill-by-bill look at how far each proposal from the final Community Conversations grid has traveled. Each policy is sorted into the same viability groups the brief uses, so the brief's top section shows what is viable overall and these spotlights show how viable one policy may be. The frequency, consensus, and concerns under each heading are what participants reported; everything else is the legislative record.</w:t>
       </w:r>
     </w:p>
     <w:p>
@@ -1227,7 +1198,7 @@
           <w:szCs w:val="25"/>
           <w:rtl w:val="0"/>
         </w:rPr>
-        <w:t xml:space="preserve">RAISE THE MINIMUM WAGE / LIVABLE WAGE</w:t>
+        <w:t xml:space="preserve">AGE-BRACKETED MINIMUM WAGE WITH A SEPARATE YOUTH WAGE</w:t>
       </w:r>
     </w:p>
     <w:p>
@@ -1246,7 +1217,7 @@
           <w:szCs w:val="20"/>
           <w:rtl w:val="0"/>
         </w:rPr>
-        <w:t xml:space="preserve">Twenty-four bills in four sessions; none ever received a recorded vote at any stage. The only enacted wage floors are for specific groups.</w:t>
+        <w:t xml:space="preserve">Raised in three of four in-person events, with high consensus: raise the minimum wage for workers over 18, so independent adults earn more than teenagers with an after-school job. The concern raised: it could limit younger South Carolinians' upward mobility. The record: the adult-raise half has been filed 24 times without ever receiving a vote; the youth-wage half has never been filed.</w:t>
       </w:r>
     </w:p>
     <w:p>
@@ -1305,7 +1276,7 @@
           <w:szCs w:val="20"/>
           <w:rtl w:val="0"/>
         </w:rPr>
-        <w:t xml:space="preserve">banned subminimum pay for workers with disabilities and enacted the Employment First Initiative Act; 43–0 and 104–4.</w:t>
+        <w:t xml:space="preserve">banned subminimum pay for workers with disabilities and enacted the Employment First Initiative Act; 43–0 and 104–4 — the one tiered-wage law in this record, and it removed a tier rather than creating one.</w:t>
       </w:r>
     </w:p>
     <w:p>
@@ -1350,6 +1321,46 @@
     </w:p>
     <w:p>
       <w:pPr>
+        <w:widowControl/>
+        <w:spacing w:after="80"/>
+        <w:ind w:left="200" w:firstLine="0"/>
+        <w:rPr/>
+      </w:pPr>
+      <w:r>
+        <w:rPr>
+          <w:rFonts w:ascii="Arial" w:cs="Arial" w:eastAsia="Arial" w:hAnsi="Arial"/>
+          <w:color w:val="c0392b"/>
+          <w:sz w:val="20"/>
+          <w:szCs w:val="20"/>
+          <w:rtl w:val="0"/>
+        </w:rPr>
+        <w:t xml:space="preserve">▪  </w:t>
+      </w:r>
+      <w:r>
+        <w:rPr>
+          <w:rFonts w:ascii="Arial" w:cs="Arial" w:eastAsia="Arial" w:hAnsi="Arial"/>
+          <w:b w:val="1"/>
+          <w:bCs w:val="1"/>
+          <w:color w:val="1a2d4f"/>
+          <w:sz w:val="20"/>
+          <w:szCs w:val="20"/>
+          <w:rtl w:val="0"/>
+        </w:rPr>
+        <w:t xml:space="preserve">Federal layer: </w:t>
+      </w:r>
+      <w:r>
+        <w:rPr>
+          <w:rFonts w:ascii="Arial" w:cs="Arial" w:eastAsia="Arial" w:hAnsi="Arial"/>
+          <w:color w:val="444444"/>
+          <w:sz w:val="20"/>
+          <w:szCs w:val="20"/>
+          <w:rtl w:val="0"/>
+        </w:rPr>
+        <w:t xml:space="preserve">a youth wage already exists in federal law — employers may pay workers under 20 as little as $4.25 an hour for their first 90 days — so a state bracket would define how far above that floor adult and teen rates sit.</w:t>
+      </w:r>
+    </w:p>
+    <w:p>
+      <w:pPr>
         <w:keepNext/>
         <w:spacing w:before="70" w:after="30" w:line="250" w:lineRule="auto"/>
         <w:rPr/>
@@ -1364,7 +1375,7 @@
           <w:szCs w:val="24"/>
           <w:rtl w:val="0"/>
         </w:rPr>
-        <w:t xml:space="preserve">Stopped early (died in first committee, no recorded vote)</w:t>
+        <w:t xml:space="preserve">Stopped early (the adult-raise half: died in first committee, no recorded vote)</w:t>
       </w:r>
     </w:p>
     <w:p>
@@ -1564,7 +1575,7 @@
           <w:szCs w:val="20"/>
           <w:rtl w:val="0"/>
         </w:rPr>
-        <w:t xml:space="preserve">S147 (2019, constitutional amendment), S633 (2021) and S28 (2023, advisory ballot questions), H3735 (2025, wage boards setting minimum pay by occupation).</w:t>
+        <w:t xml:space="preserve">S147 (2019, constitutional amendment), S633 (2021) and S28 (2023) — advisory ballot questions asking voters whether to raise the minimum wage to $15 an hour — and H3735 (2025, wage boards setting minimum pay by occupation).</w:t>
       </w:r>
     </w:p>
     <w:p>
@@ -1583,7 +1594,7 @@
           <w:szCs w:val="24"/>
           <w:rtl w:val="0"/>
         </w:rPr>
-        <w:t xml:space="preserve">Never filed</w:t>
+        <w:t xml:space="preserve">Never filed (the age-bracket half)</w:t>
       </w:r>
     </w:p>
     <w:p>
@@ -1623,7 +1634,7 @@
           <w:szCs w:val="20"/>
           <w:rtl w:val="0"/>
         </w:rPr>
-        <w:t xml:space="preserve">A bill simply lifting the ban on local minimum wages: none of the 24 bills took that route — each set a statewide floor, and the fixed-floor bills restated that local governments may not exceed it.</w:t>
+        <w:t xml:space="preserve">No bill from 2019–2026 proposes a youth wage, a training wage, or any age-based wage bracket; the terms return zero hits in every bill's full text (verified statewide by the completeness gate). None of the 24 adult-minimum bills distinguishes workers by age: each sets one floor for all covered workers.</w:t>
       </w:r>
     </w:p>
     <w:p>
@@ -1642,7 +1653,7 @@
           <w:szCs w:val="25"/>
           <w:rtl w:val="0"/>
         </w:rPr>
-        <w:t xml:space="preserve">AGE-BRACKETED MINIMUM WAGE WITH A YOUTH WAGE</w:t>
+        <w:t xml:space="preserve">WORKFORCE DEVELOPMENT: APPRENTICESHIPS, CAREER PATHWAYS, AND TECHNICAL TRAINING</w:t>
       </w:r>
     </w:p>
     <w:p>
@@ -1661,7 +1672,7 @@
           <w:szCs w:val="20"/>
           <w:rtl w:val="0"/>
         </w:rPr>
-        <w:t xml:space="preserve">The one proposal with no legislative history at all.</w:t>
+        <w:t xml:space="preserve">Raised in Greenville and Columbia, with strong agreement that these programs help people land better, higher-paying jobs. The concerns raised: that the programs mostly helped large businesses like Boeing and BMW, and that there was little awareness of the programs. The record: this is the most successful lane — six of the eight core laws, none of which lost a floor vote — and the record speaks to both concerns, below.</w:t>
       </w:r>
     </w:p>
     <w:p>
@@ -1680,7 +1691,7 @@
           <w:szCs w:val="24"/>
           <w:rtl w:val="0"/>
         </w:rPr>
-        <w:t xml:space="preserve">Never filed</w:t>
+        <w:t xml:space="preserve">Already law</w:t>
       </w:r>
     </w:p>
     <w:p>
@@ -1710,17 +1721,17 @@
           <w:szCs w:val="20"/>
           <w:rtl w:val="0"/>
         </w:rPr>
-        <w:t xml:space="preserve"> </w:t>
-      </w:r>
-      <w:r>
-        <w:rPr>
-          <w:rFonts w:ascii="Arial" w:cs="Arial" w:eastAsia="Arial" w:hAnsi="Arial"/>
-          <w:color w:val="444444"/>
-          <w:sz w:val="20"/>
-          <w:szCs w:val="20"/>
-          <w:rtl w:val="0"/>
-        </w:rPr>
-        <w:t xml:space="preserve">No bill from 2019–2026 proposes a youth wage, a training wage, or any age-based wage bracket; the terms return zero hits in every bill's full text (verified statewide by the completeness gate).</w:t>
+        <w:t xml:space="preserve">H3144 (Act 204 of 2022): </w:t>
+      </w:r>
+      <w:r>
+        <w:rPr>
+          <w:rFonts w:ascii="Arial" w:cs="Arial" w:eastAsia="Arial" w:hAnsi="Arial"/>
+          <w:color w:val="444444"/>
+          <w:sz w:val="20"/>
+          <w:szCs w:val="20"/>
+          <w:rtl w:val="0"/>
+        </w:rPr>
+        <w:t xml:space="preserve">SC WINS scholarships for technical college students in high-demand fields; 105–1 and 40–0. The money goes to students, not employers — funded by lottery provisos at $17M–$93.7M a year.</w:t>
       </w:r>
     </w:p>
     <w:p>
@@ -1750,17 +1761,17 @@
           <w:szCs w:val="20"/>
           <w:rtl w:val="0"/>
         </w:rPr>
-        <w:t xml:space="preserve"> </w:t>
-      </w:r>
-      <w:r>
-        <w:rPr>
-          <w:rFonts w:ascii="Arial" w:cs="Arial" w:eastAsia="Arial" w:hAnsi="Arial"/>
-          <w:color w:val="444444"/>
-          <w:sz w:val="20"/>
-          <w:szCs w:val="20"/>
-          <w:rtl w:val="0"/>
-        </w:rPr>
-        <w:t xml:space="preserve">Context: federal law already allows a $4.25 youth training wage for a worker's first 90 days, and South Carolina has no state minimum to bracket.</w:t>
+        <w:t xml:space="preserve">H4766 (Act 194 of 2022): </w:t>
+      </w:r>
+      <w:r>
+        <w:rPr>
+          <w:rFonts w:ascii="Arial" w:cs="Arial" w:eastAsia="Arial" w:hAnsi="Arial"/>
+          <w:color w:val="444444"/>
+          <w:sz w:val="20"/>
+          <w:szCs w:val="20"/>
+          <w:rtl w:val="0"/>
+        </w:rPr>
+        <w:t xml:space="preserve">restructured the Coordinating Council for Workforce Development; 104–1 and 40–0.</w:t>
       </w:r>
     </w:p>
     <w:p>
@@ -1790,17 +1801,554 @@
           <w:szCs w:val="20"/>
           <w:rtl w:val="0"/>
         </w:rPr>
-        <w:t xml:space="preserve">S533 (Act 209 of 2022): </w:t>
-      </w:r>
-      <w:r>
-        <w:rPr>
-          <w:rFonts w:ascii="Arial" w:cs="Arial" w:eastAsia="Arial" w:hAnsi="Arial"/>
-          <w:color w:val="444444"/>
-          <w:sz w:val="20"/>
-          <w:szCs w:val="20"/>
-          <w:rtl w:val="0"/>
-        </w:rPr>
-        <w:t xml:space="preserve">the nearest enacted law, and it runs the other way — it removed a subminimum tier rather than creating one.</w:t>
+        <w:t xml:space="preserve">H3605 (Act 13 of 2023): </w:t>
+      </w:r>
+      <w:r>
+        <w:rPr>
+          <w:rFonts w:ascii="Arial" w:cs="Arial" w:eastAsia="Arial" w:hAnsi="Arial"/>
+          <w:color w:val="444444"/>
+          <w:sz w:val="20"/>
+          <w:szCs w:val="20"/>
+          <w:rtl w:val="0"/>
+        </w:rPr>
+        <w:t xml:space="preserve">the Earn and Learn Act — registered apprenticeships and work-based learning for high-school and college credit; 114–0 and 39–0.</w:t>
+      </w:r>
+    </w:p>
+    <w:p>
+      <w:pPr>
+        <w:widowControl/>
+        <w:spacing w:after="80"/>
+        <w:ind w:left="200" w:firstLine="0"/>
+        <w:rPr/>
+      </w:pPr>
+      <w:r>
+        <w:rPr>
+          <w:rFonts w:ascii="Arial" w:cs="Arial" w:eastAsia="Arial" w:hAnsi="Arial"/>
+          <w:color w:val="c0392b"/>
+          <w:sz w:val="20"/>
+          <w:szCs w:val="20"/>
+          <w:rtl w:val="0"/>
+        </w:rPr>
+        <w:t xml:space="preserve">▪  </w:t>
+      </w:r>
+      <w:r>
+        <w:rPr>
+          <w:rFonts w:ascii="Arial" w:cs="Arial" w:eastAsia="Arial" w:hAnsi="Arial"/>
+          <w:b w:val="1"/>
+          <w:bCs w:val="1"/>
+          <w:color w:val="1a2d4f"/>
+          <w:sz w:val="20"/>
+          <w:szCs w:val="20"/>
+          <w:rtl w:val="0"/>
+        </w:rPr>
+        <w:t xml:space="preserve">H3726 (Act 67 of 2023): </w:t>
+      </w:r>
+      <w:r>
+        <w:rPr>
+          <w:rFonts w:ascii="Arial" w:cs="Arial" w:eastAsia="Arial" w:hAnsi="Arial"/>
+          <w:color w:val="444444"/>
+          <w:sz w:val="20"/>
+          <w:szCs w:val="20"/>
+          <w:rtl w:val="0"/>
+        </w:rPr>
+        <w:t xml:space="preserve">the Statewide Education and Workforce Development Act — one state office and plan; 102–3 and 41–2.</w:t>
+      </w:r>
+    </w:p>
+    <w:p>
+      <w:pPr>
+        <w:widowControl/>
+        <w:spacing w:after="80"/>
+        <w:ind w:left="200" w:firstLine="0"/>
+        <w:rPr/>
+      </w:pPr>
+      <w:r>
+        <w:rPr>
+          <w:rFonts w:ascii="Arial" w:cs="Arial" w:eastAsia="Arial" w:hAnsi="Arial"/>
+          <w:color w:val="c0392b"/>
+          <w:sz w:val="20"/>
+          <w:szCs w:val="20"/>
+          <w:rtl w:val="0"/>
+        </w:rPr>
+        <w:t xml:space="preserve">▪  </w:t>
+      </w:r>
+      <w:r>
+        <w:rPr>
+          <w:rFonts w:ascii="Arial" w:cs="Arial" w:eastAsia="Arial" w:hAnsi="Arial"/>
+          <w:b w:val="1"/>
+          <w:bCs w:val="1"/>
+          <w:color w:val="1a2d4f"/>
+          <w:sz w:val="20"/>
+          <w:szCs w:val="20"/>
+          <w:rtl w:val="0"/>
+        </w:rPr>
+        <w:t xml:space="preserve">S557 (Act 188 of 2024): </w:t>
+      </w:r>
+      <w:r>
+        <w:rPr>
+          <w:rFonts w:ascii="Arial" w:cs="Arial" w:eastAsia="Arial" w:hAnsi="Arial"/>
+          <w:color w:val="444444"/>
+          <w:sz w:val="20"/>
+          <w:szCs w:val="20"/>
+          <w:rtl w:val="0"/>
+        </w:rPr>
+        <w:t xml:space="preserve">raised the apprentice tax credit and let employers claim it longer; 42–0 and 111–0. By its text, the credit is open to any taxpayer employing an apprentice under a registered apprenticeship agreement — it is not limited by company size or industry.</w:t>
+      </w:r>
+    </w:p>
+    <w:p>
+      <w:pPr>
+        <w:widowControl/>
+        <w:spacing w:after="80"/>
+        <w:ind w:left="200" w:firstLine="0"/>
+        <w:rPr/>
+      </w:pPr>
+      <w:r>
+        <w:rPr>
+          <w:rFonts w:ascii="Arial" w:cs="Arial" w:eastAsia="Arial" w:hAnsi="Arial"/>
+          <w:color w:val="c0392b"/>
+          <w:sz w:val="20"/>
+          <w:szCs w:val="20"/>
+          <w:rtl w:val="0"/>
+        </w:rPr>
+        <w:t xml:space="preserve">▪  </w:t>
+      </w:r>
+      <w:r>
+        <w:rPr>
+          <w:rFonts w:ascii="Arial" w:cs="Arial" w:eastAsia="Arial" w:hAnsi="Arial"/>
+          <w:b w:val="1"/>
+          <w:bCs w:val="1"/>
+          <w:color w:val="1a2d4f"/>
+          <w:sz w:val="20"/>
+          <w:szCs w:val="20"/>
+          <w:rtl w:val="0"/>
+        </w:rPr>
+        <w:t xml:space="preserve">H3863 (Act 142 of 2026): </w:t>
+      </w:r>
+      <w:r>
+        <w:rPr>
+          <w:rFonts w:ascii="Arial" w:cs="Arial" w:eastAsia="Arial" w:hAnsi="Arial"/>
+          <w:color w:val="444444"/>
+          <w:sz w:val="20"/>
+          <w:szCs w:val="20"/>
+          <w:rtl w:val="0"/>
+        </w:rPr>
+        <w:t xml:space="preserve">the STEM Opportunity Act; 103–0 and 43–0.</w:t>
+      </w:r>
+    </w:p>
+    <w:p>
+      <w:pPr>
+        <w:keepNext/>
+        <w:spacing w:before="70" w:after="30" w:line="250" w:lineRule="auto"/>
+        <w:rPr/>
+      </w:pPr>
+      <w:r>
+        <w:rPr>
+          <w:rFonts w:ascii="Arial" w:cs="Arial" w:eastAsia="Arial" w:hAnsi="Arial"/>
+          <w:b w:val="1"/>
+          <w:bCs w:val="1"/>
+          <w:color w:val="2e4a78"/>
+          <w:sz w:val="24"/>
+          <w:szCs w:val="24"/>
+          <w:rtl w:val="0"/>
+        </w:rPr>
+        <w:t xml:space="preserve">On the two concerns, what is in the record</w:t>
+      </w:r>
+    </w:p>
+    <w:p>
+      <w:pPr>
+        <w:widowControl/>
+        <w:spacing w:after="80"/>
+        <w:ind w:left="200" w:firstLine="0"/>
+        <w:rPr/>
+      </w:pPr>
+      <w:r>
+        <w:rPr>
+          <w:rFonts w:ascii="Arial" w:cs="Arial" w:eastAsia="Arial" w:hAnsi="Arial"/>
+          <w:color w:val="c0392b"/>
+          <w:sz w:val="20"/>
+          <w:szCs w:val="20"/>
+          <w:rtl w:val="0"/>
+        </w:rPr>
+        <w:t xml:space="preserve">▪  </w:t>
+      </w:r>
+      <w:r>
+        <w:rPr>
+          <w:rFonts w:ascii="Arial" w:cs="Arial" w:eastAsia="Arial" w:hAnsi="Arial"/>
+          <w:b w:val="1"/>
+          <w:bCs w:val="1"/>
+          <w:color w:val="1a2d4f"/>
+          <w:sz w:val="20"/>
+          <w:szCs w:val="20"/>
+          <w:rtl w:val="0"/>
+        </w:rPr>
+        <w:t xml:space="preserve">Who the programs reach: </w:t>
+      </w:r>
+      <w:r>
+        <w:rPr>
+          <w:rFonts w:ascii="Arial" w:cs="Arial" w:eastAsia="Arial" w:hAnsi="Arial"/>
+          <w:color w:val="444444"/>
+          <w:sz w:val="20"/>
+          <w:szCs w:val="20"/>
+          <w:rtl w:val="0"/>
+        </w:rPr>
+        <w:t xml:space="preserve">the enacted designs are not written around large employers — WINS pays students, Earn and Learn connects students, and the apprentice credit is open to any employer with a registered apprentice. The record contains no enacted program restricted to large manufacturers; how take-up actually distributes across employers is outcome data this legislative record does not contain (Appendix F).</w:t>
+      </w:r>
+    </w:p>
+    <w:p>
+      <w:pPr>
+        <w:widowControl/>
+        <w:spacing w:after="80"/>
+        <w:ind w:left="200" w:firstLine="0"/>
+        <w:rPr/>
+      </w:pPr>
+      <w:r>
+        <w:rPr>
+          <w:rFonts w:ascii="Arial" w:cs="Arial" w:eastAsia="Arial" w:hAnsi="Arial"/>
+          <w:color w:val="c0392b"/>
+          <w:sz w:val="20"/>
+          <w:szCs w:val="20"/>
+          <w:rtl w:val="0"/>
+        </w:rPr>
+        <w:t xml:space="preserve">▪  </w:t>
+      </w:r>
+      <w:r>
+        <w:rPr>
+          <w:rFonts w:ascii="Arial" w:cs="Arial" w:eastAsia="Arial" w:hAnsi="Arial"/>
+          <w:b w:val="1"/>
+          <w:bCs w:val="1"/>
+          <w:color w:val="1a2d4f"/>
+          <w:sz w:val="20"/>
+          <w:szCs w:val="20"/>
+          <w:rtl w:val="0"/>
+        </w:rPr>
+        <w:t xml:space="preserve">Awareness: </w:t>
+      </w:r>
+      <w:r>
+        <w:rPr>
+          <w:rFonts w:ascii="Arial" w:cs="Arial" w:eastAsia="Arial" w:hAnsi="Arial"/>
+          <w:color w:val="444444"/>
+          <w:sz w:val="20"/>
+          <w:szCs w:val="20"/>
+          <w:rtl w:val="0"/>
+        </w:rPr>
+        <w:t xml:space="preserve">the budget already funds outreach — FY 2026-27 proviso 25.8 pays for a public-awareness campaign about manufacturing and related careers, and the SC Future Makers/Tallo proviso (1.94) funds a platform connecting students to South Carolina employers. Both are one-year budget rules, not permanent programs.</w:t>
+      </w:r>
+    </w:p>
+    <w:p>
+      <w:pPr>
+        <w:keepNext/>
+        <w:spacing w:before="70" w:after="30" w:line="250" w:lineRule="auto"/>
+        <w:rPr/>
+      </w:pPr>
+      <w:r>
+        <w:rPr>
+          <w:rFonts w:ascii="Arial" w:cs="Arial" w:eastAsia="Arial" w:hAnsi="Arial"/>
+          <w:b w:val="1"/>
+          <w:bCs w:val="1"/>
+          <w:color w:val="2e4a78"/>
+          <w:sz w:val="24"/>
+          <w:szCs w:val="24"/>
+          <w:rtl w:val="0"/>
+        </w:rPr>
+        <w:t xml:space="preserve">Proven support (passed one chamber, died in the other's committee)</w:t>
+      </w:r>
+    </w:p>
+    <w:p>
+      <w:pPr>
+        <w:widowControl/>
+        <w:spacing w:after="80"/>
+        <w:ind w:left="200" w:firstLine="0"/>
+        <w:rPr/>
+      </w:pPr>
+      <w:r>
+        <w:rPr>
+          <w:rFonts w:ascii="Arial" w:cs="Arial" w:eastAsia="Arial" w:hAnsi="Arial"/>
+          <w:color w:val="c0392b"/>
+          <w:sz w:val="20"/>
+          <w:szCs w:val="20"/>
+          <w:rtl w:val="0"/>
+        </w:rPr>
+        <w:t xml:space="preserve">▪  </w:t>
+      </w:r>
+      <w:r>
+        <w:rPr>
+          <w:rFonts w:ascii="Arial" w:cs="Arial" w:eastAsia="Arial" w:hAnsi="Arial"/>
+          <w:b w:val="1"/>
+          <w:bCs w:val="1"/>
+          <w:color w:val="1a2d4f"/>
+          <w:sz w:val="20"/>
+          <w:szCs w:val="20"/>
+          <w:rtl w:val="0"/>
+        </w:rPr>
+        <w:t xml:space="preserve">H3576 (2019): </w:t>
+      </w:r>
+      <w:r>
+        <w:rPr>
+          <w:rFonts w:ascii="Arial" w:cs="Arial" w:eastAsia="Arial" w:hAnsi="Arial"/>
+          <w:color w:val="444444"/>
+          <w:sz w:val="20"/>
+          <w:szCs w:val="20"/>
+          <w:rtl w:val="0"/>
+        </w:rPr>
+        <w:t xml:space="preserve">SC WINS 1.0; House 105–0, favorable Senate committee report, ran out of Senate calendar.</w:t>
+      </w:r>
+    </w:p>
+    <w:p>
+      <w:pPr>
+        <w:widowControl/>
+        <w:spacing w:after="80"/>
+        <w:ind w:left="200" w:firstLine="0"/>
+        <w:rPr/>
+      </w:pPr>
+      <w:r>
+        <w:rPr>
+          <w:rFonts w:ascii="Arial" w:cs="Arial" w:eastAsia="Arial" w:hAnsi="Arial"/>
+          <w:color w:val="c0392b"/>
+          <w:sz w:val="20"/>
+          <w:szCs w:val="20"/>
+          <w:rtl w:val="0"/>
+        </w:rPr>
+        <w:t xml:space="preserve">▪  </w:t>
+      </w:r>
+      <w:r>
+        <w:rPr>
+          <w:rFonts w:ascii="Arial" w:cs="Arial" w:eastAsia="Arial" w:hAnsi="Arial"/>
+          <w:b w:val="1"/>
+          <w:bCs w:val="1"/>
+          <w:color w:val="1a2d4f"/>
+          <w:sz w:val="20"/>
+          <w:szCs w:val="20"/>
+          <w:rtl w:val="0"/>
+        </w:rPr>
+        <w:t xml:space="preserve">H3759 / S419 (2019–20): </w:t>
+      </w:r>
+      <w:r>
+        <w:rPr>
+          <w:rFonts w:ascii="Arial" w:cs="Arial" w:eastAsia="Arial" w:hAnsi="Arial"/>
+          <w:color w:val="444444"/>
+          <w:sz w:val="20"/>
+          <w:szCs w:val="20"/>
+          <w:rtl w:val="0"/>
+        </w:rPr>
+        <w:t xml:space="preserve">the career-pathways overhaul; House 100–3 and Senate 40–4 respectively, both stopped when COVID ended the session.</w:t>
+      </w:r>
+    </w:p>
+    <w:p>
+      <w:pPr>
+        <w:widowControl/>
+        <w:spacing w:after="80"/>
+        <w:ind w:left="200" w:firstLine="0"/>
+        <w:rPr/>
+      </w:pPr>
+      <w:r>
+        <w:rPr>
+          <w:rFonts w:ascii="Arial" w:cs="Arial" w:eastAsia="Arial" w:hAnsi="Arial"/>
+          <w:color w:val="c0392b"/>
+          <w:sz w:val="20"/>
+          <w:szCs w:val="20"/>
+          <w:rtl w:val="0"/>
+        </w:rPr>
+        <w:t xml:space="preserve">▪  </w:t>
+      </w:r>
+      <w:r>
+        <w:rPr>
+          <w:rFonts w:ascii="Arial" w:cs="Arial" w:eastAsia="Arial" w:hAnsi="Arial"/>
+          <w:b w:val="1"/>
+          <w:bCs w:val="1"/>
+          <w:color w:val="1a2d4f"/>
+          <w:sz w:val="20"/>
+          <w:szCs w:val="20"/>
+          <w:rtl w:val="0"/>
+        </w:rPr>
+        <w:t xml:space="preserve">H3348 (2022): </w:t>
+      </w:r>
+      <w:r>
+        <w:rPr>
+          <w:rFonts w:ascii="Arial" w:cs="Arial" w:eastAsia="Arial" w:hAnsi="Arial"/>
+          <w:color w:val="444444"/>
+          <w:sz w:val="20"/>
+          <w:szCs w:val="20"/>
+          <w:rtl w:val="0"/>
+        </w:rPr>
+        <w:t xml:space="preserve">tax credits for hiring formerly incarcerated people or veterans into apprenticeships; House 106–0, died in Senate Finance.</w:t>
+      </w:r>
+    </w:p>
+    <w:p>
+      <w:pPr>
+        <w:widowControl/>
+        <w:spacing w:after="80"/>
+        <w:ind w:left="200" w:firstLine="0"/>
+        <w:rPr/>
+      </w:pPr>
+      <w:r>
+        <w:rPr>
+          <w:rFonts w:ascii="Arial" w:cs="Arial" w:eastAsia="Arial" w:hAnsi="Arial"/>
+          <w:color w:val="c0392b"/>
+          <w:sz w:val="20"/>
+          <w:szCs w:val="20"/>
+          <w:rtl w:val="0"/>
+        </w:rPr>
+        <w:t xml:space="preserve">▪  </w:t>
+      </w:r>
+      <w:r>
+        <w:rPr>
+          <w:rFonts w:ascii="Arial" w:cs="Arial" w:eastAsia="Arial" w:hAnsi="Arial"/>
+          <w:b w:val="1"/>
+          <w:bCs w:val="1"/>
+          <w:color w:val="1a2d4f"/>
+          <w:sz w:val="20"/>
+          <w:szCs w:val="20"/>
+          <w:rtl w:val="0"/>
+        </w:rPr>
+        <w:t xml:space="preserve">H4060 (2023): </w:t>
+      </w:r>
+      <w:r>
+        <w:rPr>
+          <w:rFonts w:ascii="Arial" w:cs="Arial" w:eastAsia="Arial" w:hAnsi="Arial"/>
+          <w:color w:val="444444"/>
+          <w:sz w:val="20"/>
+          <w:szCs w:val="20"/>
+          <w:rtl w:val="0"/>
+        </w:rPr>
+        <w:t xml:space="preserve">education and workforce readiness; House 108–2, died in Senate Education.</w:t>
+      </w:r>
+    </w:p>
+    <w:p>
+      <w:pPr>
+        <w:widowControl/>
+        <w:spacing w:after="80"/>
+        <w:ind w:left="200" w:firstLine="0"/>
+        <w:rPr/>
+      </w:pPr>
+      <w:r>
+        <w:rPr>
+          <w:rFonts w:ascii="Arial" w:cs="Arial" w:eastAsia="Arial" w:hAnsi="Arial"/>
+          <w:color w:val="c0392b"/>
+          <w:sz w:val="20"/>
+          <w:szCs w:val="20"/>
+          <w:rtl w:val="0"/>
+        </w:rPr>
+        <w:t xml:space="preserve">▪  </w:t>
+      </w:r>
+      <w:r>
+        <w:rPr>
+          <w:rFonts w:ascii="Arial" w:cs="Arial" w:eastAsia="Arial" w:hAnsi="Arial"/>
+          <w:b w:val="1"/>
+          <w:bCs w:val="1"/>
+          <w:color w:val="1a2d4f"/>
+          <w:sz w:val="20"/>
+          <w:szCs w:val="20"/>
+          <w:rtl w:val="0"/>
+        </w:rPr>
+        <w:t xml:space="preserve">S859 (2024): </w:t>
+      </w:r>
+      <w:r>
+        <w:rPr>
+          <w:rFonts w:ascii="Arial" w:cs="Arial" w:eastAsia="Arial" w:hAnsi="Arial"/>
+          <w:color w:val="444444"/>
+          <w:sz w:val="20"/>
+          <w:szCs w:val="20"/>
+          <w:rtl w:val="0"/>
+        </w:rPr>
+        <w:t xml:space="preserve">skills-based hiring for state jobs; Senate 42–0, died in House Labor, Commerce and Industry.</w:t>
+      </w:r>
+    </w:p>
+    <w:p>
+      <w:pPr>
+        <w:widowControl/>
+        <w:spacing w:after="80"/>
+        <w:ind w:left="200" w:firstLine="0"/>
+        <w:rPr/>
+      </w:pPr>
+      <w:r>
+        <w:rPr>
+          <w:rFonts w:ascii="Arial" w:cs="Arial" w:eastAsia="Arial" w:hAnsi="Arial"/>
+          <w:color w:val="c0392b"/>
+          <w:sz w:val="20"/>
+          <w:szCs w:val="20"/>
+          <w:rtl w:val="0"/>
+        </w:rPr>
+        <w:t xml:space="preserve">▪  </w:t>
+      </w:r>
+      <w:r>
+        <w:rPr>
+          <w:rFonts w:ascii="Arial" w:cs="Arial" w:eastAsia="Arial" w:hAnsi="Arial"/>
+          <w:b w:val="1"/>
+          <w:bCs w:val="1"/>
+          <w:color w:val="1a2d4f"/>
+          <w:sz w:val="20"/>
+          <w:szCs w:val="20"/>
+          <w:rtl w:val="0"/>
+        </w:rPr>
+        <w:t xml:space="preserve">S546 (2023) / S279 (2025): </w:t>
+      </w:r>
+      <w:r>
+        <w:rPr>
+          <w:rFonts w:ascii="Arial" w:cs="Arial" w:eastAsia="Arial" w:hAnsi="Arial"/>
+          <w:color w:val="444444"/>
+          <w:sz w:val="20"/>
+          <w:szCs w:val="20"/>
+          <w:rtl w:val="0"/>
+        </w:rPr>
+        <w:t xml:space="preserve">Department of Employment and Workforce restructuring; Senate 42–0 and 41–0, died in House committees.</w:t>
+      </w:r>
+    </w:p>
+    <w:p>
+      <w:pPr>
+        <w:keepNext/>
+        <w:spacing w:before="70" w:after="30" w:line="250" w:lineRule="auto"/>
+        <w:rPr/>
+      </w:pPr>
+      <w:r>
+        <w:rPr>
+          <w:rFonts w:ascii="Arial" w:cs="Arial" w:eastAsia="Arial" w:hAnsi="Arial"/>
+          <w:b w:val="1"/>
+          <w:bCs w:val="1"/>
+          <w:color w:val="2e4a78"/>
+          <w:sz w:val="24"/>
+          <w:szCs w:val="24"/>
+          <w:rtl w:val="0"/>
+        </w:rPr>
+        <w:t xml:space="preserve">Stopped early</w:t>
+      </w:r>
+    </w:p>
+    <w:p>
+      <w:pPr>
+        <w:widowControl/>
+        <w:spacing w:after="80"/>
+        <w:ind w:left="200" w:firstLine="0"/>
+        <w:rPr/>
+      </w:pPr>
+      <w:r>
+        <w:rPr>
+          <w:rFonts w:ascii="Arial" w:cs="Arial" w:eastAsia="Arial" w:hAnsi="Arial"/>
+          <w:color w:val="c0392b"/>
+          <w:sz w:val="20"/>
+          <w:szCs w:val="20"/>
+          <w:rtl w:val="0"/>
+        </w:rPr>
+        <w:t xml:space="preserve">▪  </w:t>
+      </w:r>
+      <w:r>
+        <w:rPr>
+          <w:rFonts w:ascii="Arial" w:cs="Arial" w:eastAsia="Arial" w:hAnsi="Arial"/>
+          <w:b w:val="1"/>
+          <w:bCs w:val="1"/>
+          <w:color w:val="1a2d4f"/>
+          <w:sz w:val="20"/>
+          <w:szCs w:val="20"/>
+          <w:rtl w:val="0"/>
+        </w:rPr>
+        <w:t xml:space="preserve"> </w:t>
+      </w:r>
+      <w:r>
+        <w:rPr>
+          <w:rFonts w:ascii="Arial" w:cs="Arial" w:eastAsia="Arial" w:hAnsi="Arial"/>
+          <w:color w:val="444444"/>
+          <w:sz w:val="20"/>
+          <w:szCs w:val="20"/>
+          <w:rtl w:val="0"/>
+        </w:rPr>
+        <w:t xml:space="preserve">Workforce Education Act (H4022, 2019), workforce diploma program (S650, 2019), education-to-job data oversight (H3757, 2019; H3611, 2021; S461, 2023), workforce readiness (H3197, 2025 — reported out, no floor vote), Dual Enrollment Opportunity Act (H4984, 2026), Service Year Act (H3225, 2025), skills-based hiring refiles (H3479, S272, 2025), apprenticeship-credit tightening (H4600, 2024).</w:t>
       </w:r>
     </w:p>
     <w:p>
@@ -1819,7 +2367,7 @@
           <w:szCs w:val="25"/>
           <w:rtl w:val="0"/>
         </w:rPr>
-        <w:t xml:space="preserve">APPRENTICESHIPS, CAREER PATHWAYS, AND TECHNICAL TRAINING</w:t>
+        <w:t xml:space="preserve">GOVERNMENT INCENTIVES / BONUSES FOR EMPLOYERS WHO PAY A LIVING WAGE</w:t>
       </w:r>
     </w:p>
     <w:p>
@@ -1838,7 +2386,7 @@
           <w:szCs w:val="20"/>
           <w:rtl w:val="0"/>
         </w:rPr>
-        <w:t xml:space="preserve">The record's most successful lane: six of the eight core laws, none of which lost a floor vote.</w:t>
+        <w:t xml:space="preserve">Raised in two of four in-person events, with mixed consensus: agreement on incentivizing employers to pay a living wage, divergence on funding and on whether the incentive should be a tax credit or a direct state bonus. The record: every pay-linked incentive filed so far uses the tax code; the direct-bonus design has never been filed.</w:t>
       </w:r>
     </w:p>
     <w:p>
@@ -1857,7 +2405,7 @@
           <w:szCs w:val="24"/>
           <w:rtl w:val="0"/>
         </w:rPr>
-        <w:t xml:space="preserve">Already law</w:t>
+        <w:t xml:space="preserve">Already law (adjacent machinery — all tax-code designs)</w:t>
       </w:r>
     </w:p>
     <w:p>
@@ -1887,17 +2435,17 @@
           <w:szCs w:val="20"/>
           <w:rtl w:val="0"/>
         </w:rPr>
-        <w:t xml:space="preserve">H3144 (Act 204 of 2022): </w:t>
-      </w:r>
-      <w:r>
-        <w:rPr>
-          <w:rFonts w:ascii="Arial" w:cs="Arial" w:eastAsia="Arial" w:hAnsi="Arial"/>
-          <w:color w:val="444444"/>
-          <w:sz w:val="20"/>
-          <w:szCs w:val="20"/>
-          <w:rtl w:val="0"/>
-        </w:rPr>
-        <w:t xml:space="preserve">SC WINS scholarships for technical college students in high-demand fields; 105–1 and 40–0. Funded by lottery provisos at $17M–$93.7M a year.</w:t>
+        <w:t xml:space="preserve">S901 (Act 237 of 2022) and H4087 (Act 222 of 2024): </w:t>
+      </w:r>
+      <w:r>
+        <w:rPr>
+          <w:rFonts w:ascii="Arial" w:cs="Arial" w:eastAsia="Arial" w:hAnsi="Arial"/>
+          <w:color w:val="444444"/>
+          <w:sz w:val="20"/>
+          <w:szCs w:val="20"/>
+          <w:rtl w:val="0"/>
+        </w:rPr>
+        <w:t xml:space="preserve">updated job development credits — the state's existing wage-linked hiring incentive, which lets approved companies keep part of employee withholding, with the amount keyed to wage levels — inside broader tax packages; 41–0/91–0 and 45–0/84–12.</w:t>
       </w:r>
     </w:p>
     <w:p>
@@ -1927,17 +2475,36 @@
           <w:szCs w:val="20"/>
           <w:rtl w:val="0"/>
         </w:rPr>
-        <w:t xml:space="preserve">H4766 (Act 194 of 2022): </w:t>
-      </w:r>
-      <w:r>
-        <w:rPr>
-          <w:rFonts w:ascii="Arial" w:cs="Arial" w:eastAsia="Arial" w:hAnsi="Arial"/>
-          <w:color w:val="444444"/>
-          <w:sz w:val="20"/>
-          <w:szCs w:val="20"/>
-          <w:rtl w:val="0"/>
-        </w:rPr>
-        <w:t xml:space="preserve">restructured the Coordinating Council for Workforce Development; 104–1 and 40–0.</w:t>
+        <w:t xml:space="preserve">S557 (Act 188 of 2024): </w:t>
+      </w:r>
+      <w:r>
+        <w:rPr>
+          <w:rFonts w:ascii="Arial" w:cs="Arial" w:eastAsia="Arial" w:hAnsi="Arial"/>
+          <w:color w:val="444444"/>
+          <w:sz w:val="20"/>
+          <w:szCs w:val="20"/>
+          <w:rtl w:val="0"/>
+        </w:rPr>
+        <w:t xml:space="preserve">the bigger apprentice hiring credit.</w:t>
+      </w:r>
+    </w:p>
+    <w:p>
+      <w:pPr>
+        <w:keepNext/>
+        <w:spacing w:before="70" w:after="30" w:line="250" w:lineRule="auto"/>
+        <w:rPr/>
+      </w:pPr>
+      <w:r>
+        <w:rPr>
+          <w:rFonts w:ascii="Arial" w:cs="Arial" w:eastAsia="Arial" w:hAnsi="Arial"/>
+          <w:b w:val="1"/>
+          <w:bCs w:val="1"/>
+          <w:color w:val="2e4a78"/>
+          <w:sz w:val="24"/>
+          <w:szCs w:val="24"/>
+          <w:rtl w:val="0"/>
+        </w:rPr>
+        <w:t xml:space="preserve">Proven support</w:t>
       </w:r>
     </w:p>
     <w:p>
@@ -1967,17 +2534,36 @@
           <w:szCs w:val="20"/>
           <w:rtl w:val="0"/>
         </w:rPr>
-        <w:t xml:space="preserve">H3605 (Act 13 of 2023): </w:t>
-      </w:r>
-      <w:r>
-        <w:rPr>
-          <w:rFonts w:ascii="Arial" w:cs="Arial" w:eastAsia="Arial" w:hAnsi="Arial"/>
-          <w:color w:val="444444"/>
-          <w:sz w:val="20"/>
-          <w:szCs w:val="20"/>
-          <w:rtl w:val="0"/>
-        </w:rPr>
-        <w:t xml:space="preserve">the Earn and Learn Act — registered apprenticeships and work-based learning for credit; 114–0 and 39–0.</w:t>
+        <w:t xml:space="preserve">H4252 (2022): </w:t>
+      </w:r>
+      <w:r>
+        <w:rPr>
+          <w:rFonts w:ascii="Arial" w:cs="Arial" w:eastAsia="Arial" w:hAnsi="Arial"/>
+          <w:color w:val="444444"/>
+          <w:sz w:val="20"/>
+          <w:szCs w:val="20"/>
+          <w:rtl w:val="0"/>
+        </w:rPr>
+        <w:t xml:space="preserve">the Redline Enterprise Zone Act — targeted hiring and investment incentives; House 103–2, died in Senate Finance.</w:t>
+      </w:r>
+    </w:p>
+    <w:p>
+      <w:pPr>
+        <w:keepNext/>
+        <w:spacing w:before="70" w:after="30" w:line="250" w:lineRule="auto"/>
+        <w:rPr/>
+      </w:pPr>
+      <w:r>
+        <w:rPr>
+          <w:rFonts w:ascii="Arial" w:cs="Arial" w:eastAsia="Arial" w:hAnsi="Arial"/>
+          <w:b w:val="1"/>
+          <w:bCs w:val="1"/>
+          <w:color w:val="2e4a78"/>
+          <w:sz w:val="24"/>
+          <w:szCs w:val="24"/>
+          <w:rtl w:val="0"/>
+        </w:rPr>
+        <w:t xml:space="preserve">Stopped early (the tax-credit versions)</w:t>
       </w:r>
     </w:p>
     <w:p>
@@ -2007,17 +2593,17 @@
           <w:szCs w:val="20"/>
           <w:rtl w:val="0"/>
         </w:rPr>
-        <w:t xml:space="preserve">H3726 (Act 67 of 2023): </w:t>
-      </w:r>
-      <w:r>
-        <w:rPr>
-          <w:rFonts w:ascii="Arial" w:cs="Arial" w:eastAsia="Arial" w:hAnsi="Arial"/>
-          <w:color w:val="444444"/>
-          <w:sz w:val="20"/>
-          <w:szCs w:val="20"/>
-          <w:rtl w:val="0"/>
-        </w:rPr>
-        <w:t xml:space="preserve">the Statewide Education and Workforce Development Act — one state office and plan; 102–3 and 41–2.</w:t>
+        <w:t xml:space="preserve">H4603 (2026): </w:t>
+      </w:r>
+      <w:r>
+        <w:rPr>
+          <w:rFonts w:ascii="Arial" w:cs="Arial" w:eastAsia="Arial" w:hAnsi="Arial"/>
+          <w:color w:val="444444"/>
+          <w:sz w:val="20"/>
+          <w:szCs w:val="20"/>
+          <w:rtl w:val="0"/>
+        </w:rPr>
+        <w:t xml:space="preserve">the Small Business Livable Wage Tax Credit Act — an income tax credit for small employers paying nonexempt workers at or above a livable wage; died in House Ways and Means without a vote. The closest filed bill to this proposal, and the record's one design aimed at small businesses specifically.</w:t>
       </w:r>
     </w:p>
     <w:p>
@@ -2047,17 +2633,17 @@
           <w:szCs w:val="20"/>
           <w:rtl w:val="0"/>
         </w:rPr>
-        <w:t xml:space="preserve">S557 (Act 188 of 2024): </w:t>
-      </w:r>
-      <w:r>
-        <w:rPr>
-          <w:rFonts w:ascii="Arial" w:cs="Arial" w:eastAsia="Arial" w:hAnsi="Arial"/>
-          <w:color w:val="444444"/>
-          <w:sz w:val="20"/>
-          <w:szCs w:val="20"/>
-          <w:rtl w:val="0"/>
-        </w:rPr>
-        <w:t xml:space="preserve">raised the apprentice tax credit and let employers claim it longer; 42–0 and 111–0.</w:t>
+        <w:t xml:space="preserve">H4245 (2025): </w:t>
+      </w:r>
+      <w:r>
+        <w:rPr>
+          <w:rFonts w:ascii="Arial" w:cs="Arial" w:eastAsia="Arial" w:hAnsi="Arial"/>
+          <w:color w:val="444444"/>
+          <w:sz w:val="20"/>
+          <w:szCs w:val="20"/>
+          <w:rtl w:val="0"/>
+        </w:rPr>
+        <w:t xml:space="preserve">tax relief for people leaving public assistance plus credits for businesses that hire and retain them; same committee, same result.</w:t>
       </w:r>
     </w:p>
     <w:p>
@@ -2087,17 +2673,97 @@
           <w:szCs w:val="20"/>
           <w:rtl w:val="0"/>
         </w:rPr>
-        <w:t xml:space="preserve">H3863 (Act 142 of 2026): </w:t>
-      </w:r>
-      <w:r>
-        <w:rPr>
-          <w:rFonts w:ascii="Arial" w:cs="Arial" w:eastAsia="Arial" w:hAnsi="Arial"/>
-          <w:color w:val="444444"/>
-          <w:sz w:val="20"/>
-          <w:szCs w:val="20"/>
-          <w:rtl w:val="0"/>
-        </w:rPr>
-        <w:t xml:space="preserve">the STEM Opportunity Act; 103–0 and 43–0.</w:t>
+        <w:t xml:space="preserve">S398 (2021): </w:t>
+      </w:r>
+      <w:r>
+        <w:rPr>
+          <w:rFonts w:ascii="Arial" w:cs="Arial" w:eastAsia="Arial" w:hAnsi="Arial"/>
+          <w:color w:val="444444"/>
+          <w:sz w:val="20"/>
+          <w:szCs w:val="20"/>
+          <w:rtl w:val="0"/>
+        </w:rPr>
+        <w:t xml:space="preserve">the accountability variant — job, wage, and health-care obligations on companies receiving state subsidies, with clawbacks; died in Senate Labor, Commerce and Industry.</w:t>
+      </w:r>
+    </w:p>
+    <w:p>
+      <w:pPr>
+        <w:widowControl/>
+        <w:spacing w:after="80"/>
+        <w:ind w:left="200" w:firstLine="0"/>
+        <w:rPr/>
+      </w:pPr>
+      <w:r>
+        <w:rPr>
+          <w:rFonts w:ascii="Arial" w:cs="Arial" w:eastAsia="Arial" w:hAnsi="Arial"/>
+          <w:color w:val="c0392b"/>
+          <w:sz w:val="20"/>
+          <w:szCs w:val="20"/>
+          <w:rtl w:val="0"/>
+        </w:rPr>
+        <w:t xml:space="preserve">▪  </w:t>
+      </w:r>
+      <w:r>
+        <w:rPr>
+          <w:rFonts w:ascii="Arial" w:cs="Arial" w:eastAsia="Arial" w:hAnsi="Arial"/>
+          <w:b w:val="1"/>
+          <w:bCs w:val="1"/>
+          <w:color w:val="1a2d4f"/>
+          <w:sz w:val="20"/>
+          <w:szCs w:val="20"/>
+          <w:rtl w:val="0"/>
+        </w:rPr>
+        <w:t xml:space="preserve">H3774 / S489 (2021): </w:t>
+      </w:r>
+      <w:r>
+        <w:rPr>
+          <w:rFonts w:ascii="Arial" w:cs="Arial" w:eastAsia="Arial" w:hAnsi="Arial"/>
+          <w:color w:val="444444"/>
+          <w:sz w:val="20"/>
+          <w:szCs w:val="20"/>
+          <w:rtl w:val="0"/>
+        </w:rPr>
+        <w:t xml:space="preserve">Enterprise Zone Act credits for professional employer organizations; died in the money committees.</w:t>
+      </w:r>
+    </w:p>
+    <w:p>
+      <w:pPr>
+        <w:widowControl/>
+        <w:spacing w:after="80"/>
+        <w:ind w:left="200" w:firstLine="0"/>
+        <w:rPr/>
+      </w:pPr>
+      <w:r>
+        <w:rPr>
+          <w:rFonts w:ascii="Arial" w:cs="Arial" w:eastAsia="Arial" w:hAnsi="Arial"/>
+          <w:color w:val="c0392b"/>
+          <w:sz w:val="20"/>
+          <w:szCs w:val="20"/>
+          <w:rtl w:val="0"/>
+        </w:rPr>
+        <w:t xml:space="preserve">▪  </w:t>
+      </w:r>
+      <w:r>
+        <w:rPr>
+          <w:rFonts w:ascii="Arial" w:cs="Arial" w:eastAsia="Arial" w:hAnsi="Arial"/>
+          <w:b w:val="1"/>
+          <w:bCs w:val="1"/>
+          <w:color w:val="1a2d4f"/>
+          <w:sz w:val="20"/>
+          <w:szCs w:val="20"/>
+          <w:rtl w:val="0"/>
+        </w:rPr>
+        <w:t xml:space="preserve">H4174 (2025): </w:t>
+      </w:r>
+      <w:r>
+        <w:rPr>
+          <w:rFonts w:ascii="Arial" w:cs="Arial" w:eastAsia="Arial" w:hAnsi="Arial"/>
+          <w:color w:val="444444"/>
+          <w:sz w:val="20"/>
+          <w:szCs w:val="20"/>
+          <w:rtl w:val="0"/>
+        </w:rPr>
+        <w:t xml:space="preserve">job development credit changes; died in House Ways and Means.</w:t>
       </w:r>
     </w:p>
     <w:p>
@@ -2116,7 +2782,7 @@
           <w:szCs w:val="24"/>
           <w:rtl w:val="0"/>
         </w:rPr>
-        <w:t xml:space="preserve">Proven support (passed one chamber, died in the other's committee)</w:t>
+        <w:t xml:space="preserve">Never filed (the direct-bonus version)</w:t>
       </w:r>
     </w:p>
     <w:p>
@@ -2146,265 +2812,6 @@
           <w:szCs w:val="20"/>
           <w:rtl w:val="0"/>
         </w:rPr>
-        <w:t xml:space="preserve">H3576 (2019): </w:t>
-      </w:r>
-      <w:r>
-        <w:rPr>
-          <w:rFonts w:ascii="Arial" w:cs="Arial" w:eastAsia="Arial" w:hAnsi="Arial"/>
-          <w:color w:val="444444"/>
-          <w:sz w:val="20"/>
-          <w:szCs w:val="20"/>
-          <w:rtl w:val="0"/>
-        </w:rPr>
-        <w:t xml:space="preserve">SC WINS 1.0; House 105–0, favorable Senate committee report, ran out of Senate calendar.</w:t>
-      </w:r>
-    </w:p>
-    <w:p>
-      <w:pPr>
-        <w:widowControl/>
-        <w:spacing w:after="80"/>
-        <w:ind w:left="200" w:firstLine="0"/>
-        <w:rPr/>
-      </w:pPr>
-      <w:r>
-        <w:rPr>
-          <w:rFonts w:ascii="Arial" w:cs="Arial" w:eastAsia="Arial" w:hAnsi="Arial"/>
-          <w:color w:val="c0392b"/>
-          <w:sz w:val="20"/>
-          <w:szCs w:val="20"/>
-          <w:rtl w:val="0"/>
-        </w:rPr>
-        <w:t xml:space="preserve">▪  </w:t>
-      </w:r>
-      <w:r>
-        <w:rPr>
-          <w:rFonts w:ascii="Arial" w:cs="Arial" w:eastAsia="Arial" w:hAnsi="Arial"/>
-          <w:b w:val="1"/>
-          <w:bCs w:val="1"/>
-          <w:color w:val="1a2d4f"/>
-          <w:sz w:val="20"/>
-          <w:szCs w:val="20"/>
-          <w:rtl w:val="0"/>
-        </w:rPr>
-        <w:t xml:space="preserve">H3759 / S419 (2019–20): </w:t>
-      </w:r>
-      <w:r>
-        <w:rPr>
-          <w:rFonts w:ascii="Arial" w:cs="Arial" w:eastAsia="Arial" w:hAnsi="Arial"/>
-          <w:color w:val="444444"/>
-          <w:sz w:val="20"/>
-          <w:szCs w:val="20"/>
-          <w:rtl w:val="0"/>
-        </w:rPr>
-        <w:t xml:space="preserve">the career-pathways overhaul; House 100–3 and Senate 40–4 respectively, both stopped when COVID ended the session.</w:t>
-      </w:r>
-    </w:p>
-    <w:p>
-      <w:pPr>
-        <w:widowControl/>
-        <w:spacing w:after="80"/>
-        <w:ind w:left="200" w:firstLine="0"/>
-        <w:rPr/>
-      </w:pPr>
-      <w:r>
-        <w:rPr>
-          <w:rFonts w:ascii="Arial" w:cs="Arial" w:eastAsia="Arial" w:hAnsi="Arial"/>
-          <w:color w:val="c0392b"/>
-          <w:sz w:val="20"/>
-          <w:szCs w:val="20"/>
-          <w:rtl w:val="0"/>
-        </w:rPr>
-        <w:t xml:space="preserve">▪  </w:t>
-      </w:r>
-      <w:r>
-        <w:rPr>
-          <w:rFonts w:ascii="Arial" w:cs="Arial" w:eastAsia="Arial" w:hAnsi="Arial"/>
-          <w:b w:val="1"/>
-          <w:bCs w:val="1"/>
-          <w:color w:val="1a2d4f"/>
-          <w:sz w:val="20"/>
-          <w:szCs w:val="20"/>
-          <w:rtl w:val="0"/>
-        </w:rPr>
-        <w:t xml:space="preserve">H3348 (2022): </w:t>
-      </w:r>
-      <w:r>
-        <w:rPr>
-          <w:rFonts w:ascii="Arial" w:cs="Arial" w:eastAsia="Arial" w:hAnsi="Arial"/>
-          <w:color w:val="444444"/>
-          <w:sz w:val="20"/>
-          <w:szCs w:val="20"/>
-          <w:rtl w:val="0"/>
-        </w:rPr>
-        <w:t xml:space="preserve">tax credits for hiring formerly incarcerated people or veterans into apprenticeships; House 106–0, died in Senate Finance.</w:t>
-      </w:r>
-    </w:p>
-    <w:p>
-      <w:pPr>
-        <w:widowControl/>
-        <w:spacing w:after="80"/>
-        <w:ind w:left="200" w:firstLine="0"/>
-        <w:rPr/>
-      </w:pPr>
-      <w:r>
-        <w:rPr>
-          <w:rFonts w:ascii="Arial" w:cs="Arial" w:eastAsia="Arial" w:hAnsi="Arial"/>
-          <w:color w:val="c0392b"/>
-          <w:sz w:val="20"/>
-          <w:szCs w:val="20"/>
-          <w:rtl w:val="0"/>
-        </w:rPr>
-        <w:t xml:space="preserve">▪  </w:t>
-      </w:r>
-      <w:r>
-        <w:rPr>
-          <w:rFonts w:ascii="Arial" w:cs="Arial" w:eastAsia="Arial" w:hAnsi="Arial"/>
-          <w:b w:val="1"/>
-          <w:bCs w:val="1"/>
-          <w:color w:val="1a2d4f"/>
-          <w:sz w:val="20"/>
-          <w:szCs w:val="20"/>
-          <w:rtl w:val="0"/>
-        </w:rPr>
-        <w:t xml:space="preserve">H4060 (2023): </w:t>
-      </w:r>
-      <w:r>
-        <w:rPr>
-          <w:rFonts w:ascii="Arial" w:cs="Arial" w:eastAsia="Arial" w:hAnsi="Arial"/>
-          <w:color w:val="444444"/>
-          <w:sz w:val="20"/>
-          <w:szCs w:val="20"/>
-          <w:rtl w:val="0"/>
-        </w:rPr>
-        <w:t xml:space="preserve">education and workforce readiness; House 108–2, died in Senate Education.</w:t>
-      </w:r>
-    </w:p>
-    <w:p>
-      <w:pPr>
-        <w:widowControl/>
-        <w:spacing w:after="80"/>
-        <w:ind w:left="200" w:firstLine="0"/>
-        <w:rPr/>
-      </w:pPr>
-      <w:r>
-        <w:rPr>
-          <w:rFonts w:ascii="Arial" w:cs="Arial" w:eastAsia="Arial" w:hAnsi="Arial"/>
-          <w:color w:val="c0392b"/>
-          <w:sz w:val="20"/>
-          <w:szCs w:val="20"/>
-          <w:rtl w:val="0"/>
-        </w:rPr>
-        <w:t xml:space="preserve">▪  </w:t>
-      </w:r>
-      <w:r>
-        <w:rPr>
-          <w:rFonts w:ascii="Arial" w:cs="Arial" w:eastAsia="Arial" w:hAnsi="Arial"/>
-          <w:b w:val="1"/>
-          <w:bCs w:val="1"/>
-          <w:color w:val="1a2d4f"/>
-          <w:sz w:val="20"/>
-          <w:szCs w:val="20"/>
-          <w:rtl w:val="0"/>
-        </w:rPr>
-        <w:t xml:space="preserve">S859 (2024): </w:t>
-      </w:r>
-      <w:r>
-        <w:rPr>
-          <w:rFonts w:ascii="Arial" w:cs="Arial" w:eastAsia="Arial" w:hAnsi="Arial"/>
-          <w:color w:val="444444"/>
-          <w:sz w:val="20"/>
-          <w:szCs w:val="20"/>
-          <w:rtl w:val="0"/>
-        </w:rPr>
-        <w:t xml:space="preserve">skills-based hiring for state jobs; Senate 42–0, died in House Labor, Commerce and Industry.</w:t>
-      </w:r>
-    </w:p>
-    <w:p>
-      <w:pPr>
-        <w:widowControl/>
-        <w:spacing w:after="80"/>
-        <w:ind w:left="200" w:firstLine="0"/>
-        <w:rPr/>
-      </w:pPr>
-      <w:r>
-        <w:rPr>
-          <w:rFonts w:ascii="Arial" w:cs="Arial" w:eastAsia="Arial" w:hAnsi="Arial"/>
-          <w:color w:val="c0392b"/>
-          <w:sz w:val="20"/>
-          <w:szCs w:val="20"/>
-          <w:rtl w:val="0"/>
-        </w:rPr>
-        <w:t xml:space="preserve">▪  </w:t>
-      </w:r>
-      <w:r>
-        <w:rPr>
-          <w:rFonts w:ascii="Arial" w:cs="Arial" w:eastAsia="Arial" w:hAnsi="Arial"/>
-          <w:b w:val="1"/>
-          <w:bCs w:val="1"/>
-          <w:color w:val="1a2d4f"/>
-          <w:sz w:val="20"/>
-          <w:szCs w:val="20"/>
-          <w:rtl w:val="0"/>
-        </w:rPr>
-        <w:t xml:space="preserve">S546 (2023) / S279 (2025): </w:t>
-      </w:r>
-      <w:r>
-        <w:rPr>
-          <w:rFonts w:ascii="Arial" w:cs="Arial" w:eastAsia="Arial" w:hAnsi="Arial"/>
-          <w:color w:val="444444"/>
-          <w:sz w:val="20"/>
-          <w:szCs w:val="20"/>
-          <w:rtl w:val="0"/>
-        </w:rPr>
-        <w:t xml:space="preserve">Department of Employment and Workforce restructuring; Senate 42–0 and 41–0, died in House committees.</w:t>
-      </w:r>
-    </w:p>
-    <w:p>
-      <w:pPr>
-        <w:keepNext/>
-        <w:spacing w:before="70" w:after="30" w:line="250" w:lineRule="auto"/>
-        <w:rPr/>
-      </w:pPr>
-      <w:r>
-        <w:rPr>
-          <w:rFonts w:ascii="Arial" w:cs="Arial" w:eastAsia="Arial" w:hAnsi="Arial"/>
-          <w:b w:val="1"/>
-          <w:bCs w:val="1"/>
-          <w:color w:val="2e4a78"/>
-          <w:sz w:val="24"/>
-          <w:szCs w:val="24"/>
-          <w:rtl w:val="0"/>
-        </w:rPr>
-        <w:t xml:space="preserve">Stopped early</w:t>
-      </w:r>
-    </w:p>
-    <w:p>
-      <w:pPr>
-        <w:widowControl/>
-        <w:spacing w:after="80"/>
-        <w:ind w:left="200" w:firstLine="0"/>
-        <w:rPr/>
-      </w:pPr>
-      <w:r>
-        <w:rPr>
-          <w:rFonts w:ascii="Arial" w:cs="Arial" w:eastAsia="Arial" w:hAnsi="Arial"/>
-          <w:color w:val="c0392b"/>
-          <w:sz w:val="20"/>
-          <w:szCs w:val="20"/>
-          <w:rtl w:val="0"/>
-        </w:rPr>
-        <w:t xml:space="preserve">▪  </w:t>
-      </w:r>
-      <w:r>
-        <w:rPr>
-          <w:rFonts w:ascii="Arial" w:cs="Arial" w:eastAsia="Arial" w:hAnsi="Arial"/>
-          <w:b w:val="1"/>
-          <w:bCs w:val="1"/>
-          <w:color w:val="1a2d4f"/>
-          <w:sz w:val="20"/>
-          <w:szCs w:val="20"/>
-          <w:rtl w:val="0"/>
-        </w:rPr>
         <w:t xml:space="preserve"> </w:t>
       </w:r>
       <w:r>
@@ -2415,462 +2822,7 @@
           <w:szCs w:val="20"/>
           <w:rtl w:val="0"/>
         </w:rPr>
-        <w:t xml:space="preserve">Workforce Education Act (H4022, 2019), workforce diploma program (S650, 2019), education-to-job data oversight (H3757, 2019; H3611, 2021; S461, 2023), workforce readiness (H3197, 2025 — reported out, no floor vote), Dual Enrollment Opportunity Act (H4984, 2026), Service Year Act (H3225, 2025), skills-based hiring refiles (H3479, S272, 2025), apprenticeship-credit tightening (H4600, 2024).</w:t>
-      </w:r>
-    </w:p>
-    <w:p>
-      <w:pPr>
-        <w:keepNext/>
-        <w:spacing w:before="84" w:after="36" w:line="254" w:lineRule="auto"/>
-        <w:rPr/>
-      </w:pPr>
-      <w:r>
-        <w:rPr>
-          <w:rFonts w:ascii="Arial" w:cs="Arial" w:eastAsia="Arial" w:hAnsi="Arial"/>
-          <w:b w:val="1"/>
-          <w:bCs w:val="1"/>
-          <w:color w:val="c0392b"/>
-          <w:sz w:val="25"/>
-          <w:szCs w:val="25"/>
-          <w:rtl w:val="0"/>
-        </w:rPr>
-        <w:t xml:space="preserve">INCENTIVES FOR EMPLOYERS PAYING A LIVING WAGE</w:t>
-      </w:r>
-    </w:p>
-    <w:p>
-      <w:pPr>
-        <w:keepNext/>
-        <w:spacing w:after="60"/>
-        <w:rPr/>
-      </w:pPr>
-      <w:r>
-        <w:rPr>
-          <w:rFonts w:ascii="Arial" w:cs="Arial" w:eastAsia="Arial" w:hAnsi="Arial"/>
-          <w:i w:val="1"/>
-          <w:iCs w:val="1"/>
-          <w:color w:val="666666"/>
-          <w:sz w:val="20"/>
-          <w:szCs w:val="20"/>
-          <w:rtl w:val="0"/>
-        </w:rPr>
-        <w:t xml:space="preserve">The exact design exists as a filed bill without a vote; the adjacent wage-linked machinery passes inside tax packages.</w:t>
-      </w:r>
-    </w:p>
-    <w:p>
-      <w:pPr>
-        <w:keepNext/>
-        <w:spacing w:before="70" w:after="30" w:line="250" w:lineRule="auto"/>
-        <w:rPr/>
-      </w:pPr>
-      <w:r>
-        <w:rPr>
-          <w:rFonts w:ascii="Arial" w:cs="Arial" w:eastAsia="Arial" w:hAnsi="Arial"/>
-          <w:b w:val="1"/>
-          <w:bCs w:val="1"/>
-          <w:color w:val="2e4a78"/>
-          <w:sz w:val="24"/>
-          <w:szCs w:val="24"/>
-          <w:rtl w:val="0"/>
-        </w:rPr>
-        <w:t xml:space="preserve">Already law (adjacent machinery)</w:t>
-      </w:r>
-    </w:p>
-    <w:p>
-      <w:pPr>
-        <w:widowControl/>
-        <w:spacing w:after="80"/>
-        <w:ind w:left="200" w:firstLine="0"/>
-        <w:rPr/>
-      </w:pPr>
-      <w:r>
-        <w:rPr>
-          <w:rFonts w:ascii="Arial" w:cs="Arial" w:eastAsia="Arial" w:hAnsi="Arial"/>
-          <w:color w:val="c0392b"/>
-          <w:sz w:val="20"/>
-          <w:szCs w:val="20"/>
-          <w:rtl w:val="0"/>
-        </w:rPr>
-        <w:t xml:space="preserve">▪  </w:t>
-      </w:r>
-      <w:r>
-        <w:rPr>
-          <w:rFonts w:ascii="Arial" w:cs="Arial" w:eastAsia="Arial" w:hAnsi="Arial"/>
-          <w:b w:val="1"/>
-          <w:bCs w:val="1"/>
-          <w:color w:val="1a2d4f"/>
-          <w:sz w:val="20"/>
-          <w:szCs w:val="20"/>
-          <w:rtl w:val="0"/>
-        </w:rPr>
-        <w:t xml:space="preserve">S901 (Act 237 of 2022) and H4087 (Act 222 of 2024): </w:t>
-      </w:r>
-      <w:r>
-        <w:rPr>
-          <w:rFonts w:ascii="Arial" w:cs="Arial" w:eastAsia="Arial" w:hAnsi="Arial"/>
-          <w:color w:val="444444"/>
-          <w:sz w:val="20"/>
-          <w:szCs w:val="20"/>
-          <w:rtl w:val="0"/>
-        </w:rPr>
-        <w:t xml:space="preserve">updated job development credits — the state's existing wage-linked hiring incentive — inside broader tax packages; 41–0/91–0 and 45–0/84–12.</w:t>
-      </w:r>
-    </w:p>
-    <w:p>
-      <w:pPr>
-        <w:widowControl/>
-        <w:spacing w:after="80"/>
-        <w:ind w:left="200" w:firstLine="0"/>
-        <w:rPr/>
-      </w:pPr>
-      <w:r>
-        <w:rPr>
-          <w:rFonts w:ascii="Arial" w:cs="Arial" w:eastAsia="Arial" w:hAnsi="Arial"/>
-          <w:color w:val="c0392b"/>
-          <w:sz w:val="20"/>
-          <w:szCs w:val="20"/>
-          <w:rtl w:val="0"/>
-        </w:rPr>
-        <w:t xml:space="preserve">▪  </w:t>
-      </w:r>
-      <w:r>
-        <w:rPr>
-          <w:rFonts w:ascii="Arial" w:cs="Arial" w:eastAsia="Arial" w:hAnsi="Arial"/>
-          <w:b w:val="1"/>
-          <w:bCs w:val="1"/>
-          <w:color w:val="1a2d4f"/>
-          <w:sz w:val="20"/>
-          <w:szCs w:val="20"/>
-          <w:rtl w:val="0"/>
-        </w:rPr>
-        <w:t xml:space="preserve">S557 (Act 188 of 2024): </w:t>
-      </w:r>
-      <w:r>
-        <w:rPr>
-          <w:rFonts w:ascii="Arial" w:cs="Arial" w:eastAsia="Arial" w:hAnsi="Arial"/>
-          <w:color w:val="444444"/>
-          <w:sz w:val="20"/>
-          <w:szCs w:val="20"/>
-          <w:rtl w:val="0"/>
-        </w:rPr>
-        <w:t xml:space="preserve">the bigger apprentice hiring credit.</w:t>
-      </w:r>
-    </w:p>
-    <w:p>
-      <w:pPr>
-        <w:keepNext/>
-        <w:spacing w:before="70" w:after="30" w:line="250" w:lineRule="auto"/>
-        <w:rPr/>
-      </w:pPr>
-      <w:r>
-        <w:rPr>
-          <w:rFonts w:ascii="Arial" w:cs="Arial" w:eastAsia="Arial" w:hAnsi="Arial"/>
-          <w:b w:val="1"/>
-          <w:bCs w:val="1"/>
-          <w:color w:val="2e4a78"/>
-          <w:sz w:val="24"/>
-          <w:szCs w:val="24"/>
-          <w:rtl w:val="0"/>
-        </w:rPr>
-        <w:t xml:space="preserve">Proven support</w:t>
-      </w:r>
-    </w:p>
-    <w:p>
-      <w:pPr>
-        <w:widowControl/>
-        <w:spacing w:after="80"/>
-        <w:ind w:left="200" w:firstLine="0"/>
-        <w:rPr/>
-      </w:pPr>
-      <w:r>
-        <w:rPr>
-          <w:rFonts w:ascii="Arial" w:cs="Arial" w:eastAsia="Arial" w:hAnsi="Arial"/>
-          <w:color w:val="c0392b"/>
-          <w:sz w:val="20"/>
-          <w:szCs w:val="20"/>
-          <w:rtl w:val="0"/>
-        </w:rPr>
-        <w:t xml:space="preserve">▪  </w:t>
-      </w:r>
-      <w:r>
-        <w:rPr>
-          <w:rFonts w:ascii="Arial" w:cs="Arial" w:eastAsia="Arial" w:hAnsi="Arial"/>
-          <w:b w:val="1"/>
-          <w:bCs w:val="1"/>
-          <w:color w:val="1a2d4f"/>
-          <w:sz w:val="20"/>
-          <w:szCs w:val="20"/>
-          <w:rtl w:val="0"/>
-        </w:rPr>
-        <w:t xml:space="preserve">H4252 (2022): </w:t>
-      </w:r>
-      <w:r>
-        <w:rPr>
-          <w:rFonts w:ascii="Arial" w:cs="Arial" w:eastAsia="Arial" w:hAnsi="Arial"/>
-          <w:color w:val="444444"/>
-          <w:sz w:val="20"/>
-          <w:szCs w:val="20"/>
-          <w:rtl w:val="0"/>
-        </w:rPr>
-        <w:t xml:space="preserve">the Redline Enterprise Zone Act — targeted hiring and investment incentives; House 103–2, died in Senate Finance.</w:t>
-      </w:r>
-    </w:p>
-    <w:p>
-      <w:pPr>
-        <w:keepNext/>
-        <w:spacing w:before="70" w:after="30" w:line="250" w:lineRule="auto"/>
-        <w:rPr/>
-      </w:pPr>
-      <w:r>
-        <w:rPr>
-          <w:rFonts w:ascii="Arial" w:cs="Arial" w:eastAsia="Arial" w:hAnsi="Arial"/>
-          <w:b w:val="1"/>
-          <w:bCs w:val="1"/>
-          <w:color w:val="2e4a78"/>
-          <w:sz w:val="24"/>
-          <w:szCs w:val="24"/>
-          <w:rtl w:val="0"/>
-        </w:rPr>
-        <w:t xml:space="preserve">Stopped early</w:t>
-      </w:r>
-    </w:p>
-    <w:p>
-      <w:pPr>
-        <w:widowControl/>
-        <w:spacing w:after="80"/>
-        <w:ind w:left="200" w:firstLine="0"/>
-        <w:rPr/>
-      </w:pPr>
-      <w:r>
-        <w:rPr>
-          <w:rFonts w:ascii="Arial" w:cs="Arial" w:eastAsia="Arial" w:hAnsi="Arial"/>
-          <w:color w:val="c0392b"/>
-          <w:sz w:val="20"/>
-          <w:szCs w:val="20"/>
-          <w:rtl w:val="0"/>
-        </w:rPr>
-        <w:t xml:space="preserve">▪  </w:t>
-      </w:r>
-      <w:r>
-        <w:rPr>
-          <w:rFonts w:ascii="Arial" w:cs="Arial" w:eastAsia="Arial" w:hAnsi="Arial"/>
-          <w:b w:val="1"/>
-          <w:bCs w:val="1"/>
-          <w:color w:val="1a2d4f"/>
-          <w:sz w:val="20"/>
-          <w:szCs w:val="20"/>
-          <w:rtl w:val="0"/>
-        </w:rPr>
-        <w:t xml:space="preserve">H4603 (2026): </w:t>
-      </w:r>
-      <w:r>
-        <w:rPr>
-          <w:rFonts w:ascii="Arial" w:cs="Arial" w:eastAsia="Arial" w:hAnsi="Arial"/>
-          <w:color w:val="444444"/>
-          <w:sz w:val="20"/>
-          <w:szCs w:val="20"/>
-          <w:rtl w:val="0"/>
-        </w:rPr>
-        <w:t xml:space="preserve">the Small Business Livable Wage Tax Credit Act — an income tax credit for small employers paying at or above a livable wage; died in House Ways and Means without a vote.</w:t>
-      </w:r>
-    </w:p>
-    <w:p>
-      <w:pPr>
-        <w:widowControl/>
-        <w:spacing w:after="80"/>
-        <w:ind w:left="200" w:firstLine="0"/>
-        <w:rPr/>
-      </w:pPr>
-      <w:r>
-        <w:rPr>
-          <w:rFonts w:ascii="Arial" w:cs="Arial" w:eastAsia="Arial" w:hAnsi="Arial"/>
-          <w:color w:val="c0392b"/>
-          <w:sz w:val="20"/>
-          <w:szCs w:val="20"/>
-          <w:rtl w:val="0"/>
-        </w:rPr>
-        <w:t xml:space="preserve">▪  </w:t>
-      </w:r>
-      <w:r>
-        <w:rPr>
-          <w:rFonts w:ascii="Arial" w:cs="Arial" w:eastAsia="Arial" w:hAnsi="Arial"/>
-          <w:b w:val="1"/>
-          <w:bCs w:val="1"/>
-          <w:color w:val="1a2d4f"/>
-          <w:sz w:val="20"/>
-          <w:szCs w:val="20"/>
-          <w:rtl w:val="0"/>
-        </w:rPr>
-        <w:t xml:space="preserve">H4245 (2025): </w:t>
-      </w:r>
-      <w:r>
-        <w:rPr>
-          <w:rFonts w:ascii="Arial" w:cs="Arial" w:eastAsia="Arial" w:hAnsi="Arial"/>
-          <w:color w:val="444444"/>
-          <w:sz w:val="20"/>
-          <w:szCs w:val="20"/>
-          <w:rtl w:val="0"/>
-        </w:rPr>
-        <w:t xml:space="preserve">tax relief for people leaving public assistance plus credits for businesses that hire and retain them; same committee, same result.</w:t>
-      </w:r>
-    </w:p>
-    <w:p>
-      <w:pPr>
-        <w:widowControl/>
-        <w:spacing w:after="80"/>
-        <w:ind w:left="200" w:firstLine="0"/>
-        <w:rPr/>
-      </w:pPr>
-      <w:r>
-        <w:rPr>
-          <w:rFonts w:ascii="Arial" w:cs="Arial" w:eastAsia="Arial" w:hAnsi="Arial"/>
-          <w:color w:val="c0392b"/>
-          <w:sz w:val="20"/>
-          <w:szCs w:val="20"/>
-          <w:rtl w:val="0"/>
-        </w:rPr>
-        <w:t xml:space="preserve">▪  </w:t>
-      </w:r>
-      <w:r>
-        <w:rPr>
-          <w:rFonts w:ascii="Arial" w:cs="Arial" w:eastAsia="Arial" w:hAnsi="Arial"/>
-          <w:b w:val="1"/>
-          <w:bCs w:val="1"/>
-          <w:color w:val="1a2d4f"/>
-          <w:sz w:val="20"/>
-          <w:szCs w:val="20"/>
-          <w:rtl w:val="0"/>
-        </w:rPr>
-        <w:t xml:space="preserve">S398 (2021): </w:t>
-      </w:r>
-      <w:r>
-        <w:rPr>
-          <w:rFonts w:ascii="Arial" w:cs="Arial" w:eastAsia="Arial" w:hAnsi="Arial"/>
-          <w:color w:val="444444"/>
-          <w:sz w:val="20"/>
-          <w:szCs w:val="20"/>
-          <w:rtl w:val="0"/>
-        </w:rPr>
-        <w:t xml:space="preserve">job, wage, and health-care obligations on subsidy recipients, with clawbacks; died in Senate Labor, Commerce and Industry.</w:t>
-      </w:r>
-    </w:p>
-    <w:p>
-      <w:pPr>
-        <w:widowControl/>
-        <w:spacing w:after="80"/>
-        <w:ind w:left="200" w:firstLine="0"/>
-        <w:rPr/>
-      </w:pPr>
-      <w:r>
-        <w:rPr>
-          <w:rFonts w:ascii="Arial" w:cs="Arial" w:eastAsia="Arial" w:hAnsi="Arial"/>
-          <w:color w:val="c0392b"/>
-          <w:sz w:val="20"/>
-          <w:szCs w:val="20"/>
-          <w:rtl w:val="0"/>
-        </w:rPr>
-        <w:t xml:space="preserve">▪  </w:t>
-      </w:r>
-      <w:r>
-        <w:rPr>
-          <w:rFonts w:ascii="Arial" w:cs="Arial" w:eastAsia="Arial" w:hAnsi="Arial"/>
-          <w:b w:val="1"/>
-          <w:bCs w:val="1"/>
-          <w:color w:val="1a2d4f"/>
-          <w:sz w:val="20"/>
-          <w:szCs w:val="20"/>
-          <w:rtl w:val="0"/>
-        </w:rPr>
-        <w:t xml:space="preserve">H3774 / S489 (2021): </w:t>
-      </w:r>
-      <w:r>
-        <w:rPr>
-          <w:rFonts w:ascii="Arial" w:cs="Arial" w:eastAsia="Arial" w:hAnsi="Arial"/>
-          <w:color w:val="444444"/>
-          <w:sz w:val="20"/>
-          <w:szCs w:val="20"/>
-          <w:rtl w:val="0"/>
-        </w:rPr>
-        <w:t xml:space="preserve">Enterprise Zone Act credits for professional employer organizations; died in the money committees.</w:t>
-      </w:r>
-    </w:p>
-    <w:p>
-      <w:pPr>
-        <w:widowControl/>
-        <w:spacing w:after="80"/>
-        <w:ind w:left="200" w:firstLine="0"/>
-        <w:rPr/>
-      </w:pPr>
-      <w:r>
-        <w:rPr>
-          <w:rFonts w:ascii="Arial" w:cs="Arial" w:eastAsia="Arial" w:hAnsi="Arial"/>
-          <w:color w:val="c0392b"/>
-          <w:sz w:val="20"/>
-          <w:szCs w:val="20"/>
-          <w:rtl w:val="0"/>
-        </w:rPr>
-        <w:t xml:space="preserve">▪  </w:t>
-      </w:r>
-      <w:r>
-        <w:rPr>
-          <w:rFonts w:ascii="Arial" w:cs="Arial" w:eastAsia="Arial" w:hAnsi="Arial"/>
-          <w:b w:val="1"/>
-          <w:bCs w:val="1"/>
-          <w:color w:val="1a2d4f"/>
-          <w:sz w:val="20"/>
-          <w:szCs w:val="20"/>
-          <w:rtl w:val="0"/>
-        </w:rPr>
-        <w:t xml:space="preserve">H5471 / S1118 (2026): </w:t>
-      </w:r>
-      <w:r>
-        <w:rPr>
-          <w:rFonts w:ascii="Arial" w:cs="Arial" w:eastAsia="Arial" w:hAnsi="Arial"/>
-          <w:color w:val="444444"/>
-          <w:sz w:val="20"/>
-          <w:szCs w:val="20"/>
-          <w:rtl w:val="0"/>
-        </w:rPr>
-        <w:t xml:space="preserve">a Headquarters Relocation and Growth Fund granting money to businesses that move or expand headquarters here; died in the money committees.</w:t>
-      </w:r>
-    </w:p>
-    <w:p>
-      <w:pPr>
-        <w:widowControl/>
-        <w:spacing w:after="80"/>
-        <w:ind w:left="200" w:firstLine="0"/>
-        <w:rPr/>
-      </w:pPr>
-      <w:r>
-        <w:rPr>
-          <w:rFonts w:ascii="Arial" w:cs="Arial" w:eastAsia="Arial" w:hAnsi="Arial"/>
-          <w:color w:val="c0392b"/>
-          <w:sz w:val="20"/>
-          <w:szCs w:val="20"/>
-          <w:rtl w:val="0"/>
-        </w:rPr>
-        <w:t xml:space="preserve">▪  </w:t>
-      </w:r>
-      <w:r>
-        <w:rPr>
-          <w:rFonts w:ascii="Arial" w:cs="Arial" w:eastAsia="Arial" w:hAnsi="Arial"/>
-          <w:b w:val="1"/>
-          <w:bCs w:val="1"/>
-          <w:color w:val="1a2d4f"/>
-          <w:sz w:val="20"/>
-          <w:szCs w:val="20"/>
-          <w:rtl w:val="0"/>
-        </w:rPr>
-        <w:t xml:space="preserve">H4174 (2025): </w:t>
-      </w:r>
-      <w:r>
-        <w:rPr>
-          <w:rFonts w:ascii="Arial" w:cs="Arial" w:eastAsia="Arial" w:hAnsi="Arial"/>
-          <w:color w:val="444444"/>
-          <w:sz w:val="20"/>
-          <w:szCs w:val="20"/>
-          <w:rtl w:val="0"/>
-        </w:rPr>
-        <w:t xml:space="preserve">job development credit changes; died in House Ways and Means.</w:t>
+        <w:t xml:space="preserve">No bill in this record proposes direct state bonus payments to employers tied to the wages they pay. The nearest grant-type mechanism filed — the Headquarters Relocation and Growth Fund (H5471 / S1118, 2026), direct grants to businesses — is tied to headquarters location, not wage levels, and died in the money committees. The funding question participants disagreed on is, in this record, decided in House Ways and Means and Senate Finance: every bill above stopped in one of those two rooms.</w:t>
       </w:r>
     </w:p>
     <w:p>
@@ -2979,7 +2931,7 @@
           <w:szCs w:val="20"/>
           <w:rtl w:val="0"/>
         </w:rPr>
-        <w:t xml:space="preserve"> A state income tax credit for employers with registered apprentices; raised and extended by S557 (Act 188 of 2024).</w:t>
+        <w:t xml:space="preserve"> A state income tax credit for employers with registered apprentices; raised and extended by S557 (Act 188 of 2024) and open to any employer with a registered apprentice.</w:t>
       </w:r>
     </w:p>
     <w:p>
@@ -3164,7 +3116,7 @@
           <w:szCs w:val="20"/>
           <w:rtl w:val="0"/>
         </w:rPr>
-        <w:t xml:space="preserve"> The $7.25-an-hour federal floor under the Fair Labor Standards Act — the wage law that actually binds in South Carolina, which has no state minimum. The FLSA also allows a $4.25 youth training wage for a worker's first 90 days.</w:t>
+        <w:t xml:space="preserve"> The $7.25-an-hour federal floor under the Fair Labor Standards Act — the wage law that actually binds in South Carolina, which has no state minimum. The FLSA also lets employers pay workers under 20 a $4.25 youth wage for their first 90 days.</w:t>
       </w:r>
     </w:p>
     <w:p>
@@ -3535,6 +3487,43 @@
           <w:rtl w:val="0"/>
         </w:rPr>
         <w:t xml:space="preserve"> A panel that sets minimum pay rates occupation by occupation; proposed by H3735 (2025), which died in its first committee.</w:t>
+      </w:r>
+    </w:p>
+    <w:p>
+      <w:pPr>
+        <w:numPr>
+          <w:ilvl w:val="0"/>
+          <w:numId w:val="2"/>
+        </w:numPr>
+        <w:spacing w:after="0" w:afterAutospacing="0" w:line="276" w:lineRule="auto"/>
+        <w:ind w:left="720" w:hanging="360"/>
+        <w:rPr>
+          <w:rFonts w:ascii="Arial" w:cs="Arial" w:eastAsia="Arial" w:hAnsi="Arial"/>
+          <w:sz w:val="10"/>
+          <w:szCs w:val="10"/>
+        </w:rPr>
+      </w:pPr>
+      <w:r>
+        <w:rPr>
+          <w:rFonts w:ascii="Arial" w:cs="Arial" w:eastAsia="Arial" w:hAnsi="Arial"/>
+          <w:b w:val="1"/>
+          <w:bCs w:val="1"/>
+          <w:color w:val="1a2d4f"/>
+          <w:sz w:val="20"/>
+          <w:szCs w:val="20"/>
+          <w:rtl w:val="0"/>
+        </w:rPr>
+        <w:t xml:space="preserve">Workforce development / DEW:</w:t>
+      </w:r>
+      <w:r>
+        <w:rPr>
+          <w:rFonts w:ascii="Arial" w:cs="Arial" w:eastAsia="Arial" w:hAnsi="Arial"/>
+          <w:color w:val="444444"/>
+          <w:sz w:val="20"/>
+          <w:szCs w:val="20"/>
+          <w:rtl w:val="0"/>
+        </w:rPr>
+        <w:t xml:space="preserve"> Programs moving people into better-paying jobs; the Department of Employment and Workforce runs unemployment insurance and workforce services, and H3726 created a statewide workforce-development office and plan.</w:t>
       </w:r>
     </w:p>
     <w:p>
@@ -3570,17 +3559,17 @@
           <w:szCs w:val="20"/>
           <w:rtl w:val="0"/>
         </w:rPr>
-        <w:t xml:space="preserve">Workforce development / DEW:</w:t>
-      </w:r>
-      <w:r>
-        <w:rPr>
-          <w:rFonts w:ascii="Arial" w:cs="Arial" w:eastAsia="Arial" w:hAnsi="Arial"/>
-          <w:color w:val="444444"/>
-          <w:sz w:val="20"/>
-          <w:szCs w:val="20"/>
-          <w:rtl w:val="0"/>
-        </w:rPr>
-        <w:t xml:space="preserve"> Programs moving people into better-paying jobs; the Department of Employment and Workforce runs unemployment insurance and workforce services, and H3726 created a statewide workforce-development office and plan.</w:t>
+        <w:t xml:space="preserve">Youth wage:</w:t>
+      </w:r>
+      <w:r>
+        <w:rPr>
+          <w:rFonts w:ascii="Arial" w:cs="Arial" w:eastAsia="Arial" w:hAnsi="Arial"/>
+          <w:color w:val="444444"/>
+          <w:sz w:val="20"/>
+          <w:szCs w:val="20"/>
+          <w:rtl w:val="0"/>
+        </w:rPr>
+        <w:t xml:space="preserve"> A lower minimum wage for younger workers. Federal law allows $4.25 an hour for workers under 20 in their first 90 days; no South Carolina bill has proposed a state version.</w:t>
       </w:r>
     </w:p>
     <w:p>
@@ -4308,7 +4297,7 @@
         <w:color w:val="cccccc"/>
         <w:rtl w:val="0"/>
       </w:rPr>
-      <w:t xml:space="preserve">SC1 Slow Wage Growth Legislative Brief v1.0</w:t>
+      <w:t xml:space="preserve">SC1 Slow Wage Growth Legislative Brief v1.1</w:t>
       <w:tab/>
       <w:tab/>
       <w:tab/>

</xml_diff>

<commit_message>
SC1 Slow Wage Growth Lege Brief v1.2: venue-scope clarifications approved by reviewer — plain-language notes that the local-wage ban covers private employers only (Charleston city and county pay their own workers $15+, verified via 6-1-130(C), press, and the county budget), that county fee-in-lieu-of-taxes incentive deals exist outside the legislative record and are not wage-tied (Title 12 Ch 44 verified live), and that workforce delivery runs through county bodies; glossaries now flow directly after the spotlights with balanced columns (fix-glossary-break.py) — no blank page gaps; sources added to Appendix I; scans and vote pairs re-verified
Co-authored-by: CaptainWrechols <CaptainWrechols@users.noreply.github.com>
</commit_message>
<xml_diff>
--- a/briefs/south-carolina/slow-wage-growth/citizen-v2/SC1-Slow-Wage-Growth-Lege-Brief.docx
+++ b/briefs/south-carolina/slow-wage-growth/citizen-v2/SC1-Slow-Wage-Growth-Lege-Brief.docx
@@ -71,7 +71,7 @@
           <w:szCs w:val="20"/>
           <w:rtl w:val="0"/>
         </w:rPr>
-        <w:t xml:space="preserve">South Carolina has no state minimum wage law: the federal floor of $7.25 an hour applies, and state law keeps cities and counties from setting a higher one. Across the last four two-year sessions (2019–2026), the General Assembly took up 106 wage-and-workforce bills in this set, and 13 became law. The record splits cleanly in two. Bills that would raise pay directly — a state minimum wage, equal-pay rules, paid sick leave — died in their first committee every single time, without a recorded vote anywhere in eight years. Bills that build pathways to better-paying jobs — apprenticeships, workforce scholarships, technical college training — became law again and again, almost always unanimously. Against that record, the three proposals that advanced out of the Community Conversations sit in three different places: workforce development is substantially law and still growing; the employer living-wage incentive exists as a filed bill that has not had a vote; and the age-bracketed minimum wage has half a record — the adult-raise half has been filed 24 times without a vote, and the youth-wage half has never been filed at all.</w:t>
+        <w:t xml:space="preserve">South Carolina has no state minimum wage law: the federal floor of $7.25 an hour applies, and state law keeps cities and counties from requiring private employers to pay more. Local governments can still raise pay for their own workers — the City of Charleston and Charleston County both moved their own employees to at least $15 an hour — but that is an employer's budget decision, not a law, and this brief covers only what the General Assembly has done. Across the last four two-year sessions (2019–2026), the General Assembly took up 106 wage-and-workforce bills in this set, and 13 became law. The record splits cleanly in two. Bills that would raise pay directly — a state minimum wage, equal-pay rules, paid sick leave — died in their first committee every single time, without a recorded vote anywhere in eight years. Bills that build pathways to better-paying jobs — apprenticeships, workforce scholarships, technical college training — became law again and again, almost always unanimously. Against that record, the three proposals that advanced out of the Community Conversations sit in three different places: workforce development is substantially law and still growing; the employer living-wage incentive exists as a filed bill that has not had a vote; and the age-bracketed minimum wage has half a record — the adult-raise half has been filed 24 times without a vote, and the youth-wage half has never been filed at all.</w:t>
       </w:r>
     </w:p>
     <w:tbl>
@@ -2035,6 +2035,46 @@
     </w:p>
     <w:p>
       <w:pPr>
+        <w:widowControl/>
+        <w:spacing w:after="80"/>
+        <w:ind w:left="200" w:firstLine="0"/>
+        <w:rPr/>
+      </w:pPr>
+      <w:r>
+        <w:rPr>
+          <w:rFonts w:ascii="Arial" w:cs="Arial" w:eastAsia="Arial" w:hAnsi="Arial"/>
+          <w:color w:val="c0392b"/>
+          <w:sz w:val="20"/>
+          <w:szCs w:val="20"/>
+          <w:rtl w:val="0"/>
+        </w:rPr>
+        <w:t xml:space="preserve">▪  </w:t>
+      </w:r>
+      <w:r>
+        <w:rPr>
+          <w:rFonts w:ascii="Arial" w:cs="Arial" w:eastAsia="Arial" w:hAnsi="Arial"/>
+          <w:b w:val="1"/>
+          <w:bCs w:val="1"/>
+          <w:color w:val="1a2d4f"/>
+          <w:sz w:val="20"/>
+          <w:szCs w:val="20"/>
+          <w:rtl w:val="0"/>
+        </w:rPr>
+        <w:t xml:space="preserve">The county role: </w:t>
+      </w:r>
+      <w:r>
+        <w:rPr>
+          <w:rFonts w:ascii="Arial" w:cs="Arial" w:eastAsia="Arial" w:hAnsi="Arial"/>
+          <w:color w:val="444444"/>
+          <w:sz w:val="20"/>
+          <w:szCs w:val="20"/>
+          <w:rtl w:val="0"/>
+        </w:rPr>
+        <w:t xml:space="preserve">the laws above are state laws, but much of the delivery runs through local bodies — each technical college answers to a local commission for the counties it serves, and the First Steps school-readiness program works through county-level partnerships (the 2023 First Steps law reorganized those local boards). So "the state passed it" and "the county runs it" are often both true.</w:t>
+      </w:r>
+    </w:p>
+    <w:p>
+      <w:pPr>
         <w:keepNext/>
         <w:spacing w:before="70" w:after="30" w:line="250" w:lineRule="auto"/>
         <w:rPr/>
@@ -2823,6 +2863,65 @@
           <w:rtl w:val="0"/>
         </w:rPr>
         <w:t xml:space="preserve">No bill in this record proposes direct state bonus payments to employers tied to the wages they pay. The nearest grant-type mechanism filed — the Headquarters Relocation and Growth Fund (H5471 / S1118, 2026), direct grants to businesses — is tied to headquarters location, not wage levels, and died in the money committees. The funding question participants disagreed on is, in this record, decided in House Ways and Means and Senate Finance: every bill above stopped in one of those two rooms.</w:t>
+      </w:r>
+    </w:p>
+    <w:p>
+      <w:pPr>
+        <w:keepNext/>
+        <w:spacing w:before="70" w:after="30" w:line="250" w:lineRule="auto"/>
+        <w:rPr/>
+      </w:pPr>
+      <w:r>
+        <w:rPr>
+          <w:rFonts w:ascii="Arial" w:cs="Arial" w:eastAsia="Arial" w:hAnsi="Arial"/>
+          <w:b w:val="1"/>
+          <w:bCs w:val="1"/>
+          <w:color w:val="2e4a78"/>
+          <w:sz w:val="24"/>
+          <w:szCs w:val="24"/>
+          <w:rtl w:val="0"/>
+        </w:rPr>
+        <w:t xml:space="preserve">The county channel (context)</w:t>
+      </w:r>
+    </w:p>
+    <w:p>
+      <w:pPr>
+        <w:widowControl/>
+        <w:spacing w:after="80"/>
+        <w:ind w:left="200" w:firstLine="0"/>
+        <w:rPr/>
+      </w:pPr>
+      <w:r>
+        <w:rPr>
+          <w:rFonts w:ascii="Arial" w:cs="Arial" w:eastAsia="Arial" w:hAnsi="Arial"/>
+          <w:color w:val="c0392b"/>
+          <w:sz w:val="20"/>
+          <w:szCs w:val="20"/>
+          <w:rtl w:val="0"/>
+        </w:rPr>
+        <w:t xml:space="preserve">▪  </w:t>
+      </w:r>
+      <w:r>
+        <w:rPr>
+          <w:rFonts w:ascii="Arial" w:cs="Arial" w:eastAsia="Arial" w:hAnsi="Arial"/>
+          <w:b w:val="1"/>
+          <w:bCs w:val="1"/>
+          <w:color w:val="1a2d4f"/>
+          <w:sz w:val="20"/>
+          <w:szCs w:val="20"/>
+          <w:rtl w:val="0"/>
+        </w:rPr>
+        <w:t xml:space="preserve"> </w:t>
+      </w:r>
+      <w:r>
+        <w:rPr>
+          <w:rFonts w:ascii="Arial" w:cs="Arial" w:eastAsia="Arial" w:hAnsi="Arial"/>
+          <w:color w:val="444444"/>
+          <w:sz w:val="20"/>
+          <w:szCs w:val="20"/>
+          <w:rtl w:val="0"/>
+        </w:rPr>
+        <w:t xml:space="preserve">Counties already make their own incentive deals with companies: property-tax discounts that state law lets a county council negotiate, called fee-in-lieu-of-taxes agreements, usually tied to promised jobs and investment. Those are deal-by-deal county decisions, not bills, so they sit outside this legislative record. No bill in this record connects that county channel to the wages a company pays — every wage-linked incentive filed so far is a state tax credit.</w:t>
       </w:r>
     </w:p>
     <w:p>
@@ -2837,7 +2936,6 @@
     <w:p>
       <w:pPr>
         <w:keepNext/>
-        <w:pageBreakBefore/>
         <w:spacing w:before="100" w:after="40" w:line="276" w:lineRule="auto"/>
         <w:rPr/>
         <w:sectPr>
@@ -3143,17 +3241,17 @@
           <w:szCs w:val="20"/>
           <w:rtl w:val="0"/>
         </w:rPr>
-        <w:t xml:space="preserve">Job development credits:</w:t>
-      </w:r>
-      <w:r>
-        <w:rPr>
-          <w:rFonts w:ascii="Arial" w:cs="Arial" w:eastAsia="Arial" w:hAnsi="Arial"/>
-          <w:color w:val="444444"/>
-          <w:sz w:val="20"/>
-          <w:szCs w:val="20"/>
-          <w:rtl w:val="0"/>
-        </w:rPr>
-        <w:t xml:space="preserve"> The state's existing wage-linked hiring incentive — approved companies keep part of employee withholding, with the amount keyed to wage levels.</w:t>
+        <w:t xml:space="preserve">Fee-in-lieu-of-taxes (FILOT) agreement:</w:t>
+      </w:r>
+      <w:r>
+        <w:rPr>
+          <w:rFonts w:ascii="Arial" w:cs="Arial" w:eastAsia="Arial" w:hAnsi="Arial"/>
+          <w:color w:val="444444"/>
+          <w:sz w:val="20"/>
+          <w:szCs w:val="20"/>
+          <w:rtl w:val="0"/>
+        </w:rPr>
+        <w:t xml:space="preserve"> A property-tax discount a county council can negotiate with a company under state law, usually tied to promised jobs and investment. These are deal-by-deal county decisions, not legislation, and none is tied to the wages a company pays.</w:t>
       </w:r>
     </w:p>
     <w:p>
@@ -3180,17 +3278,17 @@
           <w:szCs w:val="20"/>
           <w:rtl w:val="0"/>
         </w:rPr>
-        <w:t xml:space="preserve">Livable (living) wage:</w:t>
-      </w:r>
-      <w:r>
-        <w:rPr>
-          <w:rFonts w:ascii="Arial" w:cs="Arial" w:eastAsia="Arial" w:hAnsi="Arial"/>
-          <w:color w:val="444444"/>
-          <w:sz w:val="20"/>
-          <w:szCs w:val="20"/>
-          <w:rtl w:val="0"/>
-        </w:rPr>
-        <w:t xml:space="preserve"> Pay high enough to cover basic living costs; H4603 would define it for a small-business tax credit.</w:t>
+        <w:t xml:space="preserve">Job development credits:</w:t>
+      </w:r>
+      <w:r>
+        <w:rPr>
+          <w:rFonts w:ascii="Arial" w:cs="Arial" w:eastAsia="Arial" w:hAnsi="Arial"/>
+          <w:color w:val="444444"/>
+          <w:sz w:val="20"/>
+          <w:szCs w:val="20"/>
+          <w:rtl w:val="0"/>
+        </w:rPr>
+        <w:t xml:space="preserve"> The state's existing wage-linked hiring incentive — approved companies keep part of employee withholding, with the amount keyed to wage levels.</w:t>
       </w:r>
     </w:p>
     <w:p>
@@ -3217,6 +3315,43 @@
           <w:szCs w:val="20"/>
           <w:rtl w:val="0"/>
         </w:rPr>
+        <w:t xml:space="preserve">Livable (living) wage:</w:t>
+      </w:r>
+      <w:r>
+        <w:rPr>
+          <w:rFonts w:ascii="Arial" w:cs="Arial" w:eastAsia="Arial" w:hAnsi="Arial"/>
+          <w:color w:val="444444"/>
+          <w:sz w:val="20"/>
+          <w:szCs w:val="20"/>
+          <w:rtl w:val="0"/>
+        </w:rPr>
+        <w:t xml:space="preserve"> Pay high enough to cover basic living costs; H4603 would define it for a small-business tax credit.</w:t>
+      </w:r>
+    </w:p>
+    <w:p>
+      <w:pPr>
+        <w:numPr>
+          <w:ilvl w:val="0"/>
+          <w:numId w:val="2"/>
+        </w:numPr>
+        <w:spacing w:after="0" w:afterAutospacing="0" w:line="276" w:lineRule="auto"/>
+        <w:ind w:left="720" w:hanging="360"/>
+        <w:rPr>
+          <w:rFonts w:ascii="Arial" w:cs="Arial" w:eastAsia="Arial" w:hAnsi="Arial"/>
+          <w:sz w:val="10"/>
+          <w:szCs w:val="10"/>
+        </w:rPr>
+      </w:pPr>
+      <w:r>
+        <w:rPr>
+          <w:rFonts w:ascii="Arial" w:cs="Arial" w:eastAsia="Arial" w:hAnsi="Arial"/>
+          <w:b w:val="1"/>
+          <w:bCs w:val="1"/>
+          <w:color w:val="1a2d4f"/>
+          <w:sz w:val="20"/>
+          <w:szCs w:val="20"/>
+          <w:rtl w:val="0"/>
+        </w:rPr>
         <w:t xml:space="preserve">Local preemption:</w:t>
       </w:r>
       <w:r>
@@ -3227,7 +3362,7 @@
           <w:szCs w:val="20"/>
           <w:rtl w:val="0"/>
         </w:rPr>
-        <w:t xml:space="preserve"> State law bars cities and counties from setting their own minimum wage; the filed minimum-wage bills kept that ban while setting a statewide floor.</w:t>
+        <w:t xml:space="preserve"> State law bars cities and counties from making private employers pay more than the minimum wage. It does not stop them from raising pay for their own workers or in their own contracts — Charleston's city and county governments both pay their employees at least $15 an hour. The filed minimum-wage bills kept this ban while setting a statewide floor.</w:t>
       </w:r>
     </w:p>
     <w:p>
@@ -3578,7 +3713,7 @@
         <w:spacing w:before="100" w:after="40" w:line="276" w:lineRule="auto"/>
         <w:rPr/>
         <w:sectPr>
-          <w:type w:val="nextPage"/>
+          <w:type w:val="continuous"/>
           <w:pgSz w:h="15840" w:w="12240" w:orient="portrait"/>
           <w:pgMar w:bottom="864" w:top="864" w:left="864" w:right="864" w:header="720" w:footer="720"/>
         </w:sectPr>
@@ -4297,7 +4432,7 @@
         <w:color w:val="cccccc"/>
         <w:rtl w:val="0"/>
       </w:rPr>
-      <w:t xml:space="preserve">SC1 Slow Wage Growth Legislative Brief v1.1</w:t>
+      <w:t xml:space="preserve">SC1 Slow Wage Growth Legislative Brief v1.2</w:t>
       <w:tab/>
       <w:tab/>
       <w:tab/>

</xml_diff>